<commit_message>
Added Group Comparison, Heat Map, Document Settings Reports and Export Report
</commit_message>
<xml_diff>
--- a/pwiz_tools/Skyline/Documentation/Tutorials/Skyline Live Reports.docx
+++ b/pwiz_tools/Skyline/Documentation/Tutorials/Skyline Live Reports.docx
@@ -3423,6 +3423,15 @@
     </w:p>
     <w:p>
       <w:pPr>
+        <w:pStyle w:val="Heading1"/>
+      </w:pPr>
+      <w:r>
+        <w:t>Changing annotation type</w:t>
+      </w:r>
+    </w:p>
+    <w:p/>
+    <w:p>
+      <w:pPr>
         <w:pStyle w:val="ListParagraph"/>
         <w:numPr>
           <w:ilvl w:val="0"/>
@@ -4640,6 +4649,9 @@
     </w:p>
     <w:p>
       <w:r>
+        <w:rPr>
+          <w:noProof/>
+        </w:rPr>
         <w:drawing>
           <wp:inline distT="0" distB="0" distL="0" distR="0" wp14:anchorId="7C0224A7" wp14:editId="678CD824">
             <wp:extent cx="5582429" cy="4124901"/>
@@ -5182,6 +5194,9 @@
         <w:ind w:left="360"/>
       </w:pPr>
       <w:r>
+        <w:rPr>
+          <w:noProof/>
+        </w:rPr>
         <w:drawing>
           <wp:inline distT="0" distB="0" distL="0" distR="0" wp14:anchorId="712A0110" wp14:editId="7377C6D5">
             <wp:extent cx="2324424" cy="362001"/>
@@ -5750,6 +5765,9 @@
         <w:t>On the tool strip at the top of the Document Grid, click the second button from the left (</w:t>
       </w:r>
       <w:r>
+        <w:rPr>
+          <w:noProof/>
+        </w:rPr>
         <w:drawing>
           <wp:inline distT="0" distB="0" distL="0" distR="0" wp14:anchorId="2C252A4B" wp14:editId="28D443CF">
             <wp:extent cx="333422" cy="209579"/>
@@ -6023,6 +6041,9 @@
     </w:p>
     <w:p>
       <w:r>
+        <w:rPr>
+          <w:noProof/>
+        </w:rPr>
         <w:drawing>
           <wp:inline distT="0" distB="0" distL="0" distR="0" wp14:anchorId="236CF6EC" wp14:editId="6EC5880A">
             <wp:extent cx="4191585" cy="1914792"/>
@@ -7336,23 +7357,1278 @@
         <w:t xml:space="preserve"> has been removed</w:t>
       </w:r>
     </w:p>
+    <w:p>
+      <w:pPr>
+        <w:pStyle w:val="Heading1"/>
+      </w:pPr>
+      <w:r>
+        <w:t xml:space="preserve">Adding a </w:t>
+      </w:r>
+      <w:r>
+        <w:t>Group Comparison</w:t>
+      </w:r>
+    </w:p>
+    <w:p>
+      <w:pPr>
+        <w:pStyle w:val="ListParagraph"/>
+        <w:numPr>
+          <w:ilvl w:val="0"/>
+          <w:numId w:val="83"/>
+        </w:numPr>
+      </w:pPr>
+      <w:r>
+        <w:t xml:space="preserve">On the </w:t>
+      </w:r>
+      <w:r>
+        <w:rPr>
+          <w:b/>
+          <w:bCs/>
+        </w:rPr>
+        <w:t>View</w:t>
+      </w:r>
+      <w:r>
+        <w:t xml:space="preserve"> menu choose </w:t>
+      </w:r>
+      <w:r>
+        <w:rPr>
+          <w:b/>
+          <w:bCs/>
+        </w:rPr>
+        <w:t>Live Reports</w:t>
+      </w:r>
+      <w:r>
+        <w:t xml:space="preserve"> then </w:t>
+      </w:r>
+      <w:r>
+        <w:rPr>
+          <w:b/>
+          <w:bCs/>
+        </w:rPr>
+        <w:t>Group Comparisons</w:t>
+      </w:r>
+      <w:r>
+        <w:t xml:space="preserve"> then </w:t>
+      </w:r>
+      <w:r>
+        <w:rPr>
+          <w:b/>
+          <w:bCs/>
+        </w:rPr>
+        <w:t>Add</w:t>
+      </w:r>
+    </w:p>
+    <w:p>
+      <w:pPr>
+        <w:pStyle w:val="ListParagraph"/>
+        <w:numPr>
+          <w:ilvl w:val="0"/>
+          <w:numId w:val="83"/>
+        </w:numPr>
+      </w:pPr>
+      <w:r>
+        <w:t>In the Edit Group Comparison dialog, set the following values:</w:t>
+      </w:r>
+    </w:p>
+    <w:p>
+      <w:pPr>
+        <w:pStyle w:val="ListParagraph"/>
+      </w:pPr>
+      <w:r>
+        <w:t>Name: Peptide Group Comparison</w:t>
+      </w:r>
+    </w:p>
+    <w:p>
+      <w:pPr>
+        <w:pStyle w:val="ListParagraph"/>
+      </w:pPr>
+      <w:r>
+        <w:t>Control group annotation: Cohort</w:t>
+      </w:r>
+    </w:p>
+    <w:p>
+      <w:pPr>
+        <w:pStyle w:val="ListParagraph"/>
+      </w:pPr>
+      <w:r>
+        <w:t>Control group value: Healthy</w:t>
+      </w:r>
+    </w:p>
+    <w:p>
+      <w:pPr>
+        <w:pStyle w:val="ListParagraph"/>
+      </w:pPr>
+      <w:r>
+        <w:t>Value to compare against: Diseased</w:t>
+      </w:r>
+    </w:p>
+    <w:p>
+      <w:pPr>
+        <w:pStyle w:val="ListParagraph"/>
+      </w:pPr>
+      <w:r>
+        <w:t>Identity annotation: Sample ID</w:t>
+      </w:r>
+    </w:p>
+    <w:p>
+      <w:pPr>
+        <w:pStyle w:val="ListParagraph"/>
+      </w:pPr>
+      <w:r>
+        <w:t>Normalization method: Default</w:t>
+      </w:r>
+    </w:p>
+    <w:p>
+      <w:pPr>
+        <w:pStyle w:val="ListParagraph"/>
+        <w:numPr>
+          <w:ilvl w:val="0"/>
+          <w:numId w:val="83"/>
+        </w:numPr>
+      </w:pPr>
+      <w:r>
+        <w:t>Click OK on the Edit Group Comparison dialog</w:t>
+      </w:r>
+    </w:p>
+    <w:p>
+      <w:pPr>
+        <w:pStyle w:val="ListParagraph"/>
+        <w:numPr>
+          <w:ilvl w:val="0"/>
+          <w:numId w:val="83"/>
+        </w:numPr>
+      </w:pPr>
+      <w:r>
+        <w:t xml:space="preserve">On the </w:t>
+      </w:r>
+      <w:r>
+        <w:rPr>
+          <w:b/>
+          <w:bCs/>
+        </w:rPr>
+        <w:t>View</w:t>
+      </w:r>
+      <w:r>
+        <w:t xml:space="preserve"> menu choose </w:t>
+      </w:r>
+      <w:r>
+        <w:rPr>
+          <w:b/>
+          <w:bCs/>
+        </w:rPr>
+        <w:t>Live Reports</w:t>
+      </w:r>
+      <w:r>
+        <w:t xml:space="preserve"> then </w:t>
+      </w:r>
+      <w:r>
+        <w:rPr>
+          <w:b/>
+          <w:bCs/>
+        </w:rPr>
+        <w:t>Group Comparisons</w:t>
+      </w:r>
+      <w:r>
+        <w:t xml:space="preserve"> then </w:t>
+      </w:r>
+      <w:r>
+        <w:rPr>
+          <w:b/>
+          <w:bCs/>
+        </w:rPr>
+        <w:t>Peptide Group Comparison</w:t>
+      </w:r>
+    </w:p>
+    <w:p>
+      <w:pPr>
+        <w:ind w:left="360"/>
+      </w:pPr>
+      <w:r>
+        <w:t>This shows the Peptide Group Comparison grid</w:t>
+      </w:r>
+    </w:p>
+    <w:p>
+      <w:pPr>
+        <w:ind w:left="360"/>
+      </w:pPr>
+      <w:r>
+        <w:rPr>
+          <w:noProof/>
+        </w:rPr>
+        <w:lastRenderedPageBreak/>
+        <w:drawing>
+          <wp:inline distT="0" distB="0" distL="0" distR="0" wp14:anchorId="2A1E9A42" wp14:editId="2AF7AC66">
+            <wp:extent cx="5581650" cy="4124325"/>
+            <wp:effectExtent l="0" t="0" r="0" b="9525"/>
+            <wp:docPr id="569711104" name="Picture 1" descr="A screenshot of a computer&#10;&#10;Description automatically generated"/>
+            <wp:cNvGraphicFramePr>
+              <a:graphicFrameLocks xmlns:a="http://schemas.openxmlformats.org/drawingml/2006/main" noChangeAspect="1"/>
+            </wp:cNvGraphicFramePr>
+            <a:graphic xmlns:a="http://schemas.openxmlformats.org/drawingml/2006/main">
+              <a:graphicData uri="http://schemas.openxmlformats.org/drawingml/2006/picture">
+                <pic:pic xmlns:pic="http://schemas.openxmlformats.org/drawingml/2006/picture">
+                  <pic:nvPicPr>
+                    <pic:cNvPr id="569711104" name="Picture 1" descr="A screenshot of a computer&#10;&#10;Description automatically generated"/>
+                    <pic:cNvPicPr/>
+                  </pic:nvPicPr>
+                  <pic:blipFill>
+                    <a:blip r:embed="rId69"/>
+                    <a:stretch>
+                      <a:fillRect/>
+                    </a:stretch>
+                  </pic:blipFill>
+                  <pic:spPr>
+                    <a:xfrm>
+                      <a:off x="0" y="0"/>
+                      <a:ext cx="5581650" cy="4124325"/>
+                    </a:xfrm>
+                    <a:prstGeom prst="rect">
+                      <a:avLst/>
+                    </a:prstGeom>
+                  </pic:spPr>
+                </pic:pic>
+              </a:graphicData>
+            </a:graphic>
+          </wp:inline>
+        </w:drawing>
+      </w:r>
+    </w:p>
+    <w:p>
+      <w:pPr>
+        <w:pStyle w:val="ListParagraph"/>
+        <w:numPr>
+          <w:ilvl w:val="0"/>
+          <w:numId w:val="84"/>
+        </w:numPr>
+      </w:pPr>
+      <w:r>
+        <w:t xml:space="preserve">Click the </w:t>
+      </w:r>
+      <w:r>
+        <w:rPr>
+          <w:b/>
+          <w:bCs/>
+        </w:rPr>
+        <w:t>Bar Graph</w:t>
+      </w:r>
+      <w:r>
+        <w:t xml:space="preserve"> button at the top of the </w:t>
+      </w:r>
+      <w:r>
+        <w:rPr>
+          <w:b/>
+          <w:bCs/>
+        </w:rPr>
+        <w:t>Group Comparison: Grid</w:t>
+      </w:r>
+    </w:p>
+    <w:p>
+      <w:r>
+        <w:t>The bar graph plot shows the fold change values for each of the peptides that is displayed in the grid.</w:t>
+      </w:r>
+    </w:p>
+    <w:p>
+      <w:pPr>
+        <w:pStyle w:val="ListParagraph"/>
+        <w:numPr>
+          <w:ilvl w:val="0"/>
+          <w:numId w:val="84"/>
+        </w:numPr>
+      </w:pPr>
+      <w:r>
+        <w:t>Click on the Fold Change Result column header and choose “Sort Ascending”</w:t>
+      </w:r>
+    </w:p>
+    <w:p>
+      <w:r>
+        <w:rPr>
+          <w:noProof/>
+        </w:rPr>
+        <w:drawing>
+          <wp:inline distT="0" distB="0" distL="0" distR="0" wp14:anchorId="46E5982D" wp14:editId="06F20970">
+            <wp:extent cx="5943600" cy="1913255"/>
+            <wp:effectExtent l="0" t="0" r="0" b="0"/>
+            <wp:docPr id="1568606639" name="Picture 1" descr="A screenshot of a computer&#10;&#10;Description automatically generated"/>
+            <wp:cNvGraphicFramePr>
+              <a:graphicFrameLocks xmlns:a="http://schemas.openxmlformats.org/drawingml/2006/main" noChangeAspect="1"/>
+            </wp:cNvGraphicFramePr>
+            <a:graphic xmlns:a="http://schemas.openxmlformats.org/drawingml/2006/main">
+              <a:graphicData uri="http://schemas.openxmlformats.org/drawingml/2006/picture">
+                <pic:pic xmlns:pic="http://schemas.openxmlformats.org/drawingml/2006/picture">
+                  <pic:nvPicPr>
+                    <pic:cNvPr id="1568606639" name="Picture 1" descr="A screenshot of a computer&#10;&#10;Description automatically generated"/>
+                    <pic:cNvPicPr/>
+                  </pic:nvPicPr>
+                  <pic:blipFill>
+                    <a:blip r:embed="rId70"/>
+                    <a:stretch>
+                      <a:fillRect/>
+                    </a:stretch>
+                  </pic:blipFill>
+                  <pic:spPr>
+                    <a:xfrm>
+                      <a:off x="0" y="0"/>
+                      <a:ext cx="5943600" cy="1913255"/>
+                    </a:xfrm>
+                    <a:prstGeom prst="rect">
+                      <a:avLst/>
+                    </a:prstGeom>
+                  </pic:spPr>
+                </pic:pic>
+              </a:graphicData>
+            </a:graphic>
+          </wp:inline>
+        </w:drawing>
+      </w:r>
+    </w:p>
+    <w:p>
+      <w:r>
+        <w:t>The data is now sorted so that the peptides with the smallest fold change are displayed first and the peptides with the largest fold changes are displayed last.</w:t>
+      </w:r>
+    </w:p>
+    <w:p>
+      <w:pPr>
+        <w:pStyle w:val="ListParagraph"/>
+        <w:numPr>
+          <w:ilvl w:val="0"/>
+          <w:numId w:val="84"/>
+        </w:numPr>
+      </w:pPr>
+      <w:r>
+        <w:t>Click on the first peptide in the grid (</w:t>
+      </w:r>
+      <w:r>
+        <w:t>WWGQEITELAQGPGR</w:t>
+      </w:r>
+      <w:r>
+        <w:t>)</w:t>
+      </w:r>
+    </w:p>
+    <w:p>
+      <w:pPr>
+        <w:pStyle w:val="ListParagraph"/>
+        <w:numPr>
+          <w:ilvl w:val="0"/>
+          <w:numId w:val="84"/>
+        </w:numPr>
+      </w:pPr>
+      <w:r>
+        <w:lastRenderedPageBreak/>
+        <w:t>Look at the Peak Area Replicate Comparison graph</w:t>
+      </w:r>
+    </w:p>
+    <w:p>
+      <w:r>
+        <w:rPr>
+          <w:noProof/>
+        </w:rPr>
+        <w:drawing>
+          <wp:inline distT="0" distB="0" distL="0" distR="0" wp14:anchorId="0D33C745" wp14:editId="0F440648">
+            <wp:extent cx="5581650" cy="4124325"/>
+            <wp:effectExtent l="0" t="0" r="0" b="9525"/>
+            <wp:docPr id="679147926" name="Picture 1" descr="A screenshot of a graph&#10;&#10;Description automatically generated"/>
+            <wp:cNvGraphicFramePr>
+              <a:graphicFrameLocks xmlns:a="http://schemas.openxmlformats.org/drawingml/2006/main" noChangeAspect="1"/>
+            </wp:cNvGraphicFramePr>
+            <a:graphic xmlns:a="http://schemas.openxmlformats.org/drawingml/2006/main">
+              <a:graphicData uri="http://schemas.openxmlformats.org/drawingml/2006/picture">
+                <pic:pic xmlns:pic="http://schemas.openxmlformats.org/drawingml/2006/picture">
+                  <pic:nvPicPr>
+                    <pic:cNvPr id="679147926" name="Picture 1" descr="A screenshot of a graph&#10;&#10;Description automatically generated"/>
+                    <pic:cNvPicPr/>
+                  </pic:nvPicPr>
+                  <pic:blipFill>
+                    <a:blip r:embed="rId71"/>
+                    <a:stretch>
+                      <a:fillRect/>
+                    </a:stretch>
+                  </pic:blipFill>
+                  <pic:spPr>
+                    <a:xfrm>
+                      <a:off x="0" y="0"/>
+                      <a:ext cx="5581650" cy="4124325"/>
+                    </a:xfrm>
+                    <a:prstGeom prst="rect">
+                      <a:avLst/>
+                    </a:prstGeom>
+                  </pic:spPr>
+                </pic:pic>
+              </a:graphicData>
+            </a:graphic>
+          </wp:inline>
+        </w:drawing>
+      </w:r>
+    </w:p>
+    <w:p>
+      <w:r>
+        <w:t>This peptide clearly has lower abundance in the diseased replicates compared to the healthy replicates.</w:t>
+      </w:r>
+    </w:p>
+    <w:p>
+      <w:pPr>
+        <w:pStyle w:val="ListParagraph"/>
+        <w:numPr>
+          <w:ilvl w:val="0"/>
+          <w:numId w:val="85"/>
+        </w:numPr>
+      </w:pPr>
+      <w:r>
+        <w:t>Right-click on the Adjusted P-Value column and choose “Filter”</w:t>
+      </w:r>
+    </w:p>
+    <w:p>
+      <w:pPr>
+        <w:pStyle w:val="ListParagraph"/>
+        <w:numPr>
+          <w:ilvl w:val="0"/>
+          <w:numId w:val="85"/>
+        </w:numPr>
+      </w:pPr>
+      <w:r>
+        <w:t>Choose “Is Less Than” for the Filter Type and type “0.0</w:t>
+      </w:r>
+      <w:r>
+        <w:t>5</w:t>
+      </w:r>
+      <w:r>
+        <w:t>” into the text box below that</w:t>
+      </w:r>
+    </w:p>
+    <w:p>
+      <w:r>
+        <w:rPr>
+          <w:noProof/>
+        </w:rPr>
+        <w:drawing>
+          <wp:inline distT="0" distB="0" distL="0" distR="0" wp14:anchorId="0B12E58B" wp14:editId="24C749B1">
+            <wp:extent cx="5400675" cy="1676400"/>
+            <wp:effectExtent l="0" t="0" r="9525" b="0"/>
+            <wp:docPr id="1901229552" name="Picture 1" descr="A screenshot of a computer&#10;&#10;Description automatically generated"/>
+            <wp:cNvGraphicFramePr>
+              <a:graphicFrameLocks xmlns:a="http://schemas.openxmlformats.org/drawingml/2006/main" noChangeAspect="1"/>
+            </wp:cNvGraphicFramePr>
+            <a:graphic xmlns:a="http://schemas.openxmlformats.org/drawingml/2006/main">
+              <a:graphicData uri="http://schemas.openxmlformats.org/drawingml/2006/picture">
+                <pic:pic xmlns:pic="http://schemas.openxmlformats.org/drawingml/2006/picture">
+                  <pic:nvPicPr>
+                    <pic:cNvPr id="1901229552" name="Picture 1" descr="A screenshot of a computer&#10;&#10;Description automatically generated"/>
+                    <pic:cNvPicPr/>
+                  </pic:nvPicPr>
+                  <pic:blipFill>
+                    <a:blip r:embed="rId72"/>
+                    <a:stretch>
+                      <a:fillRect/>
+                    </a:stretch>
+                  </pic:blipFill>
+                  <pic:spPr>
+                    <a:xfrm>
+                      <a:off x="0" y="0"/>
+                      <a:ext cx="5400675" cy="1676400"/>
+                    </a:xfrm>
+                    <a:prstGeom prst="rect">
+                      <a:avLst/>
+                    </a:prstGeom>
+                  </pic:spPr>
+                </pic:pic>
+              </a:graphicData>
+            </a:graphic>
+          </wp:inline>
+        </w:drawing>
+      </w:r>
+    </w:p>
+    <w:p>
+      <w:pPr>
+        <w:pStyle w:val="ListParagraph"/>
+        <w:numPr>
+          <w:ilvl w:val="0"/>
+          <w:numId w:val="87"/>
+        </w:numPr>
+      </w:pPr>
+      <w:r>
+        <w:t xml:space="preserve">Click </w:t>
+      </w:r>
+      <w:r>
+        <w:rPr>
+          <w:b/>
+          <w:bCs/>
+        </w:rPr>
+        <w:t>OK</w:t>
+      </w:r>
+      <w:r>
+        <w:t xml:space="preserve"> on the dialog box</w:t>
+      </w:r>
+    </w:p>
+    <w:p>
+      <w:r>
+        <w:t xml:space="preserve">The grid and the </w:t>
+      </w:r>
+      <w:proofErr w:type="gramStart"/>
+      <w:r>
+        <w:t>graph are</w:t>
+      </w:r>
+      <w:proofErr w:type="gramEnd"/>
+      <w:r>
+        <w:t xml:space="preserve"> now showing only the rows where the adjusted P-value is less than 0.05.</w:t>
+      </w:r>
+    </w:p>
+    <w:p>
+      <w:r>
+        <w:rPr>
+          <w:noProof/>
+        </w:rPr>
+        <w:lastRenderedPageBreak/>
+        <w:drawing>
+          <wp:inline distT="0" distB="0" distL="0" distR="0" wp14:anchorId="6F88B3EB" wp14:editId="0FD5F7FC">
+            <wp:extent cx="5943600" cy="1913255"/>
+            <wp:effectExtent l="0" t="0" r="0" b="0"/>
+            <wp:docPr id="873807682" name="Picture 1" descr="A screenshot of a computer&#10;&#10;Description automatically generated"/>
+            <wp:cNvGraphicFramePr>
+              <a:graphicFrameLocks xmlns:a="http://schemas.openxmlformats.org/drawingml/2006/main" noChangeAspect="1"/>
+            </wp:cNvGraphicFramePr>
+            <a:graphic xmlns:a="http://schemas.openxmlformats.org/drawingml/2006/main">
+              <a:graphicData uri="http://schemas.openxmlformats.org/drawingml/2006/picture">
+                <pic:pic xmlns:pic="http://schemas.openxmlformats.org/drawingml/2006/picture">
+                  <pic:nvPicPr>
+                    <pic:cNvPr id="873807682" name="Picture 1" descr="A screenshot of a computer&#10;&#10;Description automatically generated"/>
+                    <pic:cNvPicPr/>
+                  </pic:nvPicPr>
+                  <pic:blipFill>
+                    <a:blip r:embed="rId73"/>
+                    <a:stretch>
+                      <a:fillRect/>
+                    </a:stretch>
+                  </pic:blipFill>
+                  <pic:spPr>
+                    <a:xfrm>
+                      <a:off x="0" y="0"/>
+                      <a:ext cx="5943600" cy="1913255"/>
+                    </a:xfrm>
+                    <a:prstGeom prst="rect">
+                      <a:avLst/>
+                    </a:prstGeom>
+                  </pic:spPr>
+                </pic:pic>
+              </a:graphicData>
+            </a:graphic>
+          </wp:inline>
+        </w:drawing>
+      </w:r>
+    </w:p>
+    <w:p>
+      <w:pPr>
+        <w:pStyle w:val="ListParagraph"/>
+        <w:numPr>
+          <w:ilvl w:val="0"/>
+          <w:numId w:val="87"/>
+        </w:numPr>
+      </w:pPr>
+      <w:r>
+        <w:t>Close the Peptide Group Comparison Bar Graph by clicking the gray X at the right edge of that window’s title bar. Do not click the red X above it because that will close both the grid and the bar graph</w:t>
+      </w:r>
+    </w:p>
+    <w:p>
+      <w:pPr>
+        <w:pStyle w:val="Heading1"/>
+      </w:pPr>
+      <w:r>
+        <w:t>Showing abundances with the group comparison results</w:t>
+      </w:r>
+    </w:p>
+    <w:p>
+      <w:r>
+        <w:t>The group comparison grid can also show the per-replicate abundances which contributed to the fold change calculation</w:t>
+      </w:r>
+    </w:p>
+    <w:p>
+      <w:pPr>
+        <w:pStyle w:val="ListParagraph"/>
+        <w:numPr>
+          <w:ilvl w:val="0"/>
+          <w:numId w:val="87"/>
+        </w:numPr>
+      </w:pPr>
+      <w:r>
+        <w:t xml:space="preserve">On the Reports dropdown at the top of the </w:t>
+      </w:r>
+      <w:r>
+        <w:rPr>
+          <w:b/>
+          <w:bCs/>
+        </w:rPr>
+        <w:t>Peptide Group Comparison Grid</w:t>
+      </w:r>
+      <w:r>
+        <w:t xml:space="preserve"> choose </w:t>
+      </w:r>
+      <w:r>
+        <w:rPr>
+          <w:b/>
+          <w:bCs/>
+        </w:rPr>
+        <w:t>Customize Report</w:t>
+      </w:r>
+    </w:p>
+    <w:p>
+      <w:pPr>
+        <w:pStyle w:val="ListParagraph"/>
+        <w:numPr>
+          <w:ilvl w:val="0"/>
+          <w:numId w:val="87"/>
+        </w:numPr>
+      </w:pPr>
+      <w:r>
+        <w:t>Click t</w:t>
+      </w:r>
+      <w:r>
+        <w:t>he + button next to Replicate Abundances at the bottom of the tree in the Customize Report dialog to expand it</w:t>
+      </w:r>
+    </w:p>
+    <w:p>
+      <w:pPr>
+        <w:pStyle w:val="ListParagraph"/>
+        <w:numPr>
+          <w:ilvl w:val="0"/>
+          <w:numId w:val="87"/>
+        </w:numPr>
+      </w:pPr>
+      <w:r>
+        <w:t>Check the checkbox next to Abundance</w:t>
+      </w:r>
+    </w:p>
+    <w:p>
+      <w:pPr>
+        <w:pStyle w:val="ListParagraph"/>
+        <w:numPr>
+          <w:ilvl w:val="0"/>
+          <w:numId w:val="87"/>
+        </w:numPr>
+        <w:rPr>
+          <w:b/>
+          <w:bCs/>
+        </w:rPr>
+      </w:pPr>
+      <w:r>
+        <w:t xml:space="preserve">Type </w:t>
+      </w:r>
+      <w:r>
+        <w:rPr>
+          <w:b/>
+          <w:bCs/>
+        </w:rPr>
+        <w:t>Replicate Abundances</w:t>
+      </w:r>
+      <w:r>
+        <w:rPr>
+          <w:b/>
+          <w:bCs/>
+        </w:rPr>
+        <w:t xml:space="preserve"> </w:t>
+      </w:r>
+      <w:r>
+        <w:t xml:space="preserve">in the </w:t>
+      </w:r>
+      <w:r>
+        <w:rPr>
+          <w:b/>
+          <w:bCs/>
+        </w:rPr>
+        <w:t>Report Name</w:t>
+      </w:r>
+      <w:r>
+        <w:t xml:space="preserve"> field</w:t>
+      </w:r>
+    </w:p>
+    <w:p>
+      <w:pPr>
+        <w:pStyle w:val="ListParagraph"/>
+        <w:numPr>
+          <w:ilvl w:val="0"/>
+          <w:numId w:val="87"/>
+        </w:numPr>
+        <w:rPr>
+          <w:b/>
+          <w:bCs/>
+        </w:rPr>
+      </w:pPr>
+      <w:r>
+        <w:t>Click OK in the Customize Report dialog</w:t>
+      </w:r>
+    </w:p>
+    <w:p>
+      <w:pPr>
+        <w:rPr>
+          <w:b/>
+          <w:bCs/>
+        </w:rPr>
+      </w:pPr>
+      <w:r>
+        <w:rPr>
+          <w:noProof/>
+        </w:rPr>
+        <w:drawing>
+          <wp:inline distT="0" distB="0" distL="0" distR="0" wp14:anchorId="1325B0D9" wp14:editId="36A9BA4D">
+            <wp:extent cx="5943600" cy="1913255"/>
+            <wp:effectExtent l="0" t="0" r="0" b="0"/>
+            <wp:docPr id="1961010847" name="Picture 1" descr="A screenshot of a computer&#10;&#10;Description automatically generated"/>
+            <wp:cNvGraphicFramePr>
+              <a:graphicFrameLocks xmlns:a="http://schemas.openxmlformats.org/drawingml/2006/main" noChangeAspect="1"/>
+            </wp:cNvGraphicFramePr>
+            <a:graphic xmlns:a="http://schemas.openxmlformats.org/drawingml/2006/main">
+              <a:graphicData uri="http://schemas.openxmlformats.org/drawingml/2006/picture">
+                <pic:pic xmlns:pic="http://schemas.openxmlformats.org/drawingml/2006/picture">
+                  <pic:nvPicPr>
+                    <pic:cNvPr id="1961010847" name="Picture 1" descr="A screenshot of a computer&#10;&#10;Description automatically generated"/>
+                    <pic:cNvPicPr/>
+                  </pic:nvPicPr>
+                  <pic:blipFill>
+                    <a:blip r:embed="rId74"/>
+                    <a:stretch>
+                      <a:fillRect/>
+                    </a:stretch>
+                  </pic:blipFill>
+                  <pic:spPr>
+                    <a:xfrm>
+                      <a:off x="0" y="0"/>
+                      <a:ext cx="5943600" cy="1913255"/>
+                    </a:xfrm>
+                    <a:prstGeom prst="rect">
+                      <a:avLst/>
+                    </a:prstGeom>
+                  </pic:spPr>
+                </pic:pic>
+              </a:graphicData>
+            </a:graphic>
+          </wp:inline>
+        </w:drawing>
+      </w:r>
+    </w:p>
+    <w:p>
+      <w:r>
+        <w:t xml:space="preserve">The grid now shows abundances for each peptide and replicate. The values shown in the </w:t>
+      </w:r>
+      <w:r>
+        <w:t xml:space="preserve">cells are equal to the </w:t>
+      </w:r>
+      <w:r>
+        <w:rPr>
+          <w:b/>
+          <w:bCs/>
+        </w:rPr>
+        <w:t>Normalized Area Strict</w:t>
+      </w:r>
+      <w:r>
+        <w:rPr>
+          <w:b/>
+          <w:bCs/>
+        </w:rPr>
+        <w:t xml:space="preserve"> </w:t>
+      </w:r>
+      <w:r>
+        <w:t>value</w:t>
+      </w:r>
+      <w:r>
+        <w:t>s that were seen in the Document Grid, except that the values in the group comparison grid have been divided by the number of transitions in the peptide.</w:t>
+      </w:r>
+    </w:p>
+    <w:p>
+      <w:pPr>
+        <w:pStyle w:val="Heading1"/>
+      </w:pPr>
+      <w:r>
+        <w:lastRenderedPageBreak/>
+        <w:t xml:space="preserve">Showing </w:t>
+      </w:r>
+      <w:r>
+        <w:t>a heat map with dendrograms</w:t>
+      </w:r>
+    </w:p>
+    <w:p>
+      <w:pPr>
+        <w:pStyle w:val="ListParagraph"/>
+        <w:numPr>
+          <w:ilvl w:val="0"/>
+          <w:numId w:val="89"/>
+        </w:numPr>
+      </w:pPr>
+      <w:r>
+        <w:t>Click the inverted triangle to the right of the third button from the left on the tool strip at the top of the Peptide Group Comparison Grid window</w:t>
+      </w:r>
+    </w:p>
+    <w:p>
+      <w:pPr>
+        <w:pStyle w:val="ListParagraph"/>
+        <w:numPr>
+          <w:ilvl w:val="0"/>
+          <w:numId w:val="89"/>
+        </w:numPr>
+      </w:pPr>
+      <w:r>
+        <w:t xml:space="preserve">Choose </w:t>
+      </w:r>
+      <w:r>
+        <w:rPr>
+          <w:b/>
+          <w:bCs/>
+        </w:rPr>
+        <w:t>Show Heat Map</w:t>
+      </w:r>
+      <w:r>
+        <w:rPr>
+          <w:b/>
+          <w:bCs/>
+        </w:rPr>
+        <w:t xml:space="preserve"> </w:t>
+      </w:r>
+      <w:r>
+        <w:t xml:space="preserve">from the </w:t>
+      </w:r>
+      <w:proofErr w:type="gramStart"/>
+      <w:r>
+        <w:t>drop down</w:t>
+      </w:r>
+      <w:proofErr w:type="gramEnd"/>
+      <w:r>
+        <w:t xml:space="preserve"> menu</w:t>
+      </w:r>
+    </w:p>
+    <w:p>
+      <w:r>
+        <w:drawing>
+          <wp:inline distT="0" distB="0" distL="0" distR="0" wp14:anchorId="1FAA93FF" wp14:editId="6DFC693D">
+            <wp:extent cx="2943636" cy="1743318"/>
+            <wp:effectExtent l="0" t="0" r="9525" b="9525"/>
+            <wp:docPr id="468785121" name="Picture 1"/>
+            <wp:cNvGraphicFramePr>
+              <a:graphicFrameLocks xmlns:a="http://schemas.openxmlformats.org/drawingml/2006/main" noChangeAspect="1"/>
+            </wp:cNvGraphicFramePr>
+            <a:graphic xmlns:a="http://schemas.openxmlformats.org/drawingml/2006/main">
+              <a:graphicData uri="http://schemas.openxmlformats.org/drawingml/2006/picture">
+                <pic:pic xmlns:pic="http://schemas.openxmlformats.org/drawingml/2006/picture">
+                  <pic:nvPicPr>
+                    <pic:cNvPr id="468785121" name=""/>
+                    <pic:cNvPicPr/>
+                  </pic:nvPicPr>
+                  <pic:blipFill>
+                    <a:blip r:embed="rId75"/>
+                    <a:stretch>
+                      <a:fillRect/>
+                    </a:stretch>
+                  </pic:blipFill>
+                  <pic:spPr>
+                    <a:xfrm>
+                      <a:off x="0" y="0"/>
+                      <a:ext cx="2943636" cy="1743318"/>
+                    </a:xfrm>
+                    <a:prstGeom prst="rect">
+                      <a:avLst/>
+                    </a:prstGeom>
+                  </pic:spPr>
+                </pic:pic>
+              </a:graphicData>
+            </a:graphic>
+          </wp:inline>
+        </w:drawing>
+      </w:r>
+    </w:p>
+    <w:p>
+      <w:pPr>
+        <w:ind w:left="360"/>
+      </w:pPr>
+      <w:r>
+        <w:t xml:space="preserve">Skyline displays a heat map where the peptides and replicates have been reordered so that the dendrograms above and to the right of the graph can be drawn to indicate which rows and columns are most </w:t>
+      </w:r>
+      <w:proofErr w:type="gramStart"/>
+      <w:r>
+        <w:t>similar to</w:t>
+      </w:r>
+      <w:proofErr w:type="gramEnd"/>
+      <w:r>
+        <w:t xml:space="preserve"> each other</w:t>
+      </w:r>
+    </w:p>
+    <w:p>
+      <w:pPr>
+        <w:pStyle w:val="Heading1"/>
+      </w:pPr>
+      <w:r>
+        <w:t>Adding report definitions to the document</w:t>
+      </w:r>
+    </w:p>
+    <w:p>
+      <w:pPr>
+        <w:pStyle w:val="ListParagraph"/>
+        <w:numPr>
+          <w:ilvl w:val="0"/>
+          <w:numId w:val="90"/>
+        </w:numPr>
+      </w:pPr>
+      <w:r>
+        <w:t>On the View menu choose Document Settings</w:t>
+      </w:r>
+    </w:p>
+    <w:p>
+      <w:pPr>
+        <w:pStyle w:val="ListParagraph"/>
+        <w:numPr>
+          <w:ilvl w:val="0"/>
+          <w:numId w:val="90"/>
+        </w:numPr>
+      </w:pPr>
+      <w:r>
+        <w:t>Click the Reports tab in the Document Settings dialog</w:t>
+      </w:r>
+    </w:p>
+    <w:p>
+      <w:r>
+        <w:t xml:space="preserve">This shows all the custom reports that Skyline knows about. These reports include the “Peptide Areas” which we created in the Document Grid and the “Replicate Abundances” report from the Group Comparison grid. There are also some small molecule reports which would only show up in the Document Grid if this were a small molecule or mixed mode document instead of a proteomics </w:t>
+      </w:r>
+      <w:r>
+        <w:lastRenderedPageBreak/>
+        <w:t>document.</w:t>
+      </w:r>
+      <w:r>
+        <w:rPr>
+          <w:noProof/>
+        </w:rPr>
+        <w:t xml:space="preserve"> </w:t>
+      </w:r>
+      <w:r>
+        <w:rPr>
+          <w:noProof/>
+        </w:rPr>
+        <w:drawing>
+          <wp:inline distT="0" distB="0" distL="0" distR="0" wp14:anchorId="57EC02A5" wp14:editId="126BAE20">
+            <wp:extent cx="5943600" cy="3370580"/>
+            <wp:effectExtent l="0" t="0" r="0" b="1270"/>
+            <wp:docPr id="355687627" name="Picture 1"/>
+            <wp:cNvGraphicFramePr>
+              <a:graphicFrameLocks xmlns:a="http://schemas.openxmlformats.org/drawingml/2006/main" noChangeAspect="1"/>
+            </wp:cNvGraphicFramePr>
+            <a:graphic xmlns:a="http://schemas.openxmlformats.org/drawingml/2006/main">
+              <a:graphicData uri="http://schemas.openxmlformats.org/drawingml/2006/picture">
+                <pic:pic xmlns:pic="http://schemas.openxmlformats.org/drawingml/2006/picture">
+                  <pic:nvPicPr>
+                    <pic:cNvPr id="355687627" name=""/>
+                    <pic:cNvPicPr/>
+                  </pic:nvPicPr>
+                  <pic:blipFill>
+                    <a:blip r:embed="rId76"/>
+                    <a:stretch>
+                      <a:fillRect/>
+                    </a:stretch>
+                  </pic:blipFill>
+                  <pic:spPr>
+                    <a:xfrm>
+                      <a:off x="0" y="0"/>
+                      <a:ext cx="5943600" cy="3370580"/>
+                    </a:xfrm>
+                    <a:prstGeom prst="rect">
+                      <a:avLst/>
+                    </a:prstGeom>
+                  </pic:spPr>
+                </pic:pic>
+              </a:graphicData>
+            </a:graphic>
+          </wp:inline>
+        </w:drawing>
+      </w:r>
+    </w:p>
+    <w:p>
+      <w:pPr>
+        <w:pStyle w:val="ListParagraph"/>
+        <w:numPr>
+          <w:ilvl w:val="0"/>
+          <w:numId w:val="91"/>
+        </w:numPr>
+      </w:pPr>
+      <w:r>
+        <w:t>Check the checkbox next to Peptide Areas and Replicate Abundances</w:t>
+      </w:r>
+    </w:p>
+    <w:p>
+      <w:pPr>
+        <w:pStyle w:val="ListParagraph"/>
+        <w:numPr>
+          <w:ilvl w:val="0"/>
+          <w:numId w:val="91"/>
+        </w:numPr>
+      </w:pPr>
+      <w:r>
+        <w:t>Click OK in the Document Settings dialog</w:t>
+      </w:r>
+    </w:p>
+    <w:p>
+      <w:r>
+        <w:t>The Replicate Abundances and Peptide Areas report definitions are now part of this document.</w:t>
+      </w:r>
+    </w:p>
+    <w:p>
+      <w:r>
+        <w:t xml:space="preserve">If you were to use the “File &gt; Share” menu item to </w:t>
+      </w:r>
+      <w:r>
+        <w:t xml:space="preserve">create </w:t>
+      </w:r>
+      <w:proofErr w:type="gramStart"/>
+      <w:r>
+        <w:t>a .</w:t>
+      </w:r>
+      <w:proofErr w:type="gramEnd"/>
+      <w:r>
+        <w:t>sky.zip file containing this document and send that document to someone else, when they opened that document the “Peptide Areas” and “Replicate Abundances” report definitions from this document would be added to the list of reports in their Skyline instance.</w:t>
+      </w:r>
+    </w:p>
+    <w:p>
+      <w:pPr>
+        <w:pStyle w:val="Heading1"/>
+      </w:pPr>
+      <w:r>
+        <w:t>Inspecting the audit log</w:t>
+      </w:r>
+    </w:p>
+    <w:p>
+      <w:pPr>
+        <w:pStyle w:val="ListParagraph"/>
+        <w:numPr>
+          <w:ilvl w:val="0"/>
+          <w:numId w:val="92"/>
+        </w:numPr>
+      </w:pPr>
+      <w:r>
+        <w:t>On the View menu choose Live Reports and then Audit Log</w:t>
+      </w:r>
+    </w:p>
+    <w:p>
+      <w:r>
+        <w:rPr>
+          <w:noProof/>
+        </w:rPr>
+        <w:lastRenderedPageBreak/>
+        <w:drawing>
+          <wp:inline distT="0" distB="0" distL="0" distR="0" wp14:anchorId="4B42544D" wp14:editId="06FFB605">
+            <wp:extent cx="5943600" cy="2899410"/>
+            <wp:effectExtent l="0" t="0" r="0" b="0"/>
+            <wp:docPr id="1262631228" name="Picture 1"/>
+            <wp:cNvGraphicFramePr>
+              <a:graphicFrameLocks xmlns:a="http://schemas.openxmlformats.org/drawingml/2006/main" noChangeAspect="1"/>
+            </wp:cNvGraphicFramePr>
+            <a:graphic xmlns:a="http://schemas.openxmlformats.org/drawingml/2006/main">
+              <a:graphicData uri="http://schemas.openxmlformats.org/drawingml/2006/picture">
+                <pic:pic xmlns:pic="http://schemas.openxmlformats.org/drawingml/2006/picture">
+                  <pic:nvPicPr>
+                    <pic:cNvPr id="1262631228" name=""/>
+                    <pic:cNvPicPr/>
+                  </pic:nvPicPr>
+                  <pic:blipFill>
+                    <a:blip r:embed="rId77"/>
+                    <a:stretch>
+                      <a:fillRect/>
+                    </a:stretch>
+                  </pic:blipFill>
+                  <pic:spPr>
+                    <a:xfrm>
+                      <a:off x="0" y="0"/>
+                      <a:ext cx="5943600" cy="2899410"/>
+                    </a:xfrm>
+                    <a:prstGeom prst="rect">
+                      <a:avLst/>
+                    </a:prstGeom>
+                  </pic:spPr>
+                </pic:pic>
+              </a:graphicData>
+            </a:graphic>
+          </wp:inline>
+        </w:drawing>
+      </w:r>
+    </w:p>
+    <w:p>
+      <w:r>
+        <w:t>This shows in detail the operations that have modified this document.</w:t>
+      </w:r>
+    </w:p>
+    <w:p>
+      <w:pPr>
+        <w:pStyle w:val="ListParagraph"/>
+        <w:numPr>
+          <w:ilvl w:val="0"/>
+          <w:numId w:val="92"/>
+        </w:numPr>
+      </w:pPr>
+      <w:r>
+        <w:t>In the Reports dropdown at the top of the Audit Log window choose Summary</w:t>
+      </w:r>
+    </w:p>
+    <w:p>
+      <w:r>
+        <w:t>This shows a more concise list of things that have happened to the document with one row per operation.</w:t>
+      </w:r>
+    </w:p>
+    <w:p>
+      <w:r>
+        <w:rPr>
+          <w:noProof/>
+        </w:rPr>
+        <w:drawing>
+          <wp:inline distT="0" distB="0" distL="0" distR="0" wp14:anchorId="46E904D7" wp14:editId="43982A45">
+            <wp:extent cx="5943600" cy="2899410"/>
+            <wp:effectExtent l="0" t="0" r="0" b="0"/>
+            <wp:docPr id="350451190" name="Picture 1" descr="A screenshot of a computer&#10;&#10;Description automatically generated"/>
+            <wp:cNvGraphicFramePr>
+              <a:graphicFrameLocks xmlns:a="http://schemas.openxmlformats.org/drawingml/2006/main" noChangeAspect="1"/>
+            </wp:cNvGraphicFramePr>
+            <a:graphic xmlns:a="http://schemas.openxmlformats.org/drawingml/2006/main">
+              <a:graphicData uri="http://schemas.openxmlformats.org/drawingml/2006/picture">
+                <pic:pic xmlns:pic="http://schemas.openxmlformats.org/drawingml/2006/picture">
+                  <pic:nvPicPr>
+                    <pic:cNvPr id="350451190" name="Picture 1" descr="A screenshot of a computer&#10;&#10;Description automatically generated"/>
+                    <pic:cNvPicPr/>
+                  </pic:nvPicPr>
+                  <pic:blipFill>
+                    <a:blip r:embed="rId78"/>
+                    <a:stretch>
+                      <a:fillRect/>
+                    </a:stretch>
+                  </pic:blipFill>
+                  <pic:spPr>
+                    <a:xfrm>
+                      <a:off x="0" y="0"/>
+                      <a:ext cx="5943600" cy="2899410"/>
+                    </a:xfrm>
+                    <a:prstGeom prst="rect">
+                      <a:avLst/>
+                    </a:prstGeom>
+                  </pic:spPr>
+                </pic:pic>
+              </a:graphicData>
+            </a:graphic>
+          </wp:inline>
+        </w:drawing>
+      </w:r>
+    </w:p>
     <w:p/>
-    <w:p>
-      <w:pPr>
-        <w:ind w:left="360"/>
-      </w:pPr>
+    <w:p/>
+    <w:p/>
+    <w:p>
+      <w:pPr>
+        <w:pStyle w:val="Heading1"/>
+      </w:pPr>
+      <w:r>
+        <w:lastRenderedPageBreak/>
+        <w:t>Exporting a report</w:t>
+      </w:r>
     </w:p>
     <w:p>
       <w:pPr>
         <w:pStyle w:val="ListParagraph"/>
-      </w:pPr>
-    </w:p>
+        <w:numPr>
+          <w:ilvl w:val="0"/>
+          <w:numId w:val="92"/>
+        </w:numPr>
+      </w:pPr>
+      <w:r>
+        <w:t xml:space="preserve">On the </w:t>
+      </w:r>
+      <w:r>
+        <w:rPr>
+          <w:b/>
+          <w:bCs/>
+        </w:rPr>
+        <w:t>File</w:t>
+      </w:r>
+      <w:r>
+        <w:t xml:space="preserve"> menu choose </w:t>
+      </w:r>
+      <w:r>
+        <w:rPr>
+          <w:b/>
+          <w:bCs/>
+        </w:rPr>
+        <w:t>Export</w:t>
+      </w:r>
+      <w:r>
+        <w:t xml:space="preserve"> and then </w:t>
+      </w:r>
+      <w:r>
+        <w:rPr>
+          <w:b/>
+          <w:bCs/>
+        </w:rPr>
+        <w:t>Report</w:t>
+      </w:r>
+    </w:p>
+    <w:p>
+      <w:r>
+        <w:rPr>
+          <w:noProof/>
+        </w:rPr>
+        <w:drawing>
+          <wp:inline distT="0" distB="0" distL="0" distR="0" wp14:anchorId="2D24EA0D" wp14:editId="6B262466">
+            <wp:extent cx="3533775" cy="3962400"/>
+            <wp:effectExtent l="0" t="0" r="9525" b="0"/>
+            <wp:docPr id="782861650" name="Picture 1" descr="A screenshot of a computer&#10;&#10;Description automatically generated"/>
+            <wp:cNvGraphicFramePr>
+              <a:graphicFrameLocks xmlns:a="http://schemas.openxmlformats.org/drawingml/2006/main" noChangeAspect="1"/>
+            </wp:cNvGraphicFramePr>
+            <a:graphic xmlns:a="http://schemas.openxmlformats.org/drawingml/2006/main">
+              <a:graphicData uri="http://schemas.openxmlformats.org/drawingml/2006/picture">
+                <pic:pic xmlns:pic="http://schemas.openxmlformats.org/drawingml/2006/picture">
+                  <pic:nvPicPr>
+                    <pic:cNvPr id="782861650" name="Picture 1" descr="A screenshot of a computer&#10;&#10;Description automatically generated"/>
+                    <pic:cNvPicPr/>
+                  </pic:nvPicPr>
+                  <pic:blipFill>
+                    <a:blip r:embed="rId79"/>
+                    <a:stretch>
+                      <a:fillRect/>
+                    </a:stretch>
+                  </pic:blipFill>
+                  <pic:spPr>
+                    <a:xfrm>
+                      <a:off x="0" y="0"/>
+                      <a:ext cx="3533775" cy="3962400"/>
+                    </a:xfrm>
+                    <a:prstGeom prst="rect">
+                      <a:avLst/>
+                    </a:prstGeom>
+                  </pic:spPr>
+                </pic:pic>
+              </a:graphicData>
+            </a:graphic>
+          </wp:inline>
+        </w:drawing>
+      </w:r>
+    </w:p>
+    <w:p>
+      <w:r>
+        <w:t xml:space="preserve">This dialog allows exporting of reports from the Document Grid. The </w:t>
+      </w:r>
+      <w:r>
+        <w:rPr>
+          <w:b/>
+          <w:bCs/>
+        </w:rPr>
+        <w:t>Peptide Areas</w:t>
+      </w:r>
+      <w:r>
+        <w:rPr>
+          <w:b/>
+          <w:bCs/>
+        </w:rPr>
+        <w:t xml:space="preserve"> </w:t>
+      </w:r>
+      <w:r>
+        <w:t>tha</w:t>
+      </w:r>
+      <w:r>
+        <w:t>t we designed in this tutorial is one of the choices. The “Replicate Abundances” report from the Group Comparison grid is not one of the choices because this dialog only allows exporting of Document Grid reports.</w:t>
+      </w:r>
+    </w:p>
+    <w:p/>
     <w:p/>
     <w:p/>
     <w:p/>
     <w:sectPr>
-      <w:headerReference w:type="default" r:id="rId69"/>
-      <w:footerReference w:type="default" r:id="rId70"/>
+      <w:headerReference w:type="default" r:id="rId80"/>
+      <w:footerReference w:type="default" r:id="rId81"/>
       <w:pgSz w:w="12240" w:h="15840"/>
       <w:pgMar w:top="1440" w:right="1440" w:bottom="1440" w:left="1440" w:header="720" w:footer="720" w:gutter="0"/>
       <w:cols w:space="720"/>
@@ -7487,6 +8763,119 @@
 <file path=word/numbering.xml><?xml version="1.0" encoding="utf-8"?>
 <w:numbering xmlns:wpc="http://schemas.microsoft.com/office/word/2010/wordprocessingCanvas" xmlns:cx="http://schemas.microsoft.com/office/drawing/2014/chartex" xmlns:cx1="http://schemas.microsoft.com/office/drawing/2015/9/8/chartex" xmlns:cx2="http://schemas.microsoft.com/office/drawing/2015/10/21/chartex" xmlns:cx3="http://schemas.microsoft.com/office/drawing/2016/5/9/chartex" xmlns:cx4="http://schemas.microsoft.com/office/drawing/2016/5/10/chartex" xmlns:cx5="http://schemas.microsoft.com/office/drawing/2016/5/11/chartex" xmlns:cx6="http://schemas.microsoft.com/office/drawing/2016/5/12/chartex" xmlns:cx7="http://schemas.microsoft.com/office/drawing/2016/5/13/chartex" xmlns:cx8="http://schemas.microsoft.com/office/drawing/2016/5/14/chartex" xmlns:mc="http://schemas.openxmlformats.org/markup-compatibility/2006" xmlns:aink="http://schemas.microsoft.com/office/drawing/2016/ink" xmlns:am3d="http://schemas.microsoft.com/office/drawing/2017/model3d" xmlns:o="urn:schemas-microsoft-com:office:office" xmlns:oel="http://schemas.microsoft.com/office/2019/extlst" xmlns:r="http://schemas.openxmlformats.org/officeDocument/2006/relationships" xmlns:m="http://schemas.openxmlformats.org/officeDocument/2006/math" xmlns:v="urn:schemas-microsoft-com:vml" xmlns:wp14="http://schemas.microsoft.com/office/word/2010/wordprocessingDrawing" xmlns:wp="http://schemas.openxmlformats.org/drawingml/2006/wordprocessingDrawing" xmlns:w10="urn:schemas-microsoft-com:office:word" xmlns:w="http://schemas.openxmlformats.org/wordprocessingml/2006/main" xmlns:w14="http://schemas.microsoft.com/office/word/2010/wordml" xmlns:w15="http://schemas.microsoft.com/office/word/2012/wordml" xmlns:w16cex="http://schemas.microsoft.com/office/word/2018/wordml/cex" xmlns:w16cid="http://schemas.microsoft.com/office/word/2016/wordml/cid" xmlns:w16="http://schemas.microsoft.com/office/word/2018/wordml" xmlns:w16du="http://schemas.microsoft.com/office/word/2023/wordml/word16du" xmlns:w16sdtdh="http://schemas.microsoft.com/office/word/2020/wordml/sdtdatahash" xmlns:w16se="http://schemas.microsoft.com/office/word/2015/wordml/symex" xmlns:wpg="http://schemas.microsoft.com/office/word/2010/wordprocessingGroup" xmlns:wpi="http://schemas.microsoft.com/office/word/2010/wordprocessingInk" xmlns:wne="http://schemas.microsoft.com/office/word/2006/wordml" xmlns:wps="http://schemas.microsoft.com/office/word/2010/wordprocessingShape" mc:Ignorable="w14 w15 w16se w16cid w16 w16cex w16sdtdh w16du wp14">
   <w:abstractNum w:abstractNumId="0" w15:restartNumberingAfterBreak="0">
+    <w:nsid w:val="024663E0"/>
+    <w:multiLevelType w:val="hybridMultilevel"/>
+    <w:tmpl w:val="C86C90F8"/>
+    <w:lvl w:ilvl="0" w:tplc="04090001">
+      <w:start w:val="1"/>
+      <w:numFmt w:val="bullet"/>
+      <w:lvlText w:val=""/>
+      <w:lvlJc w:val="left"/>
+      <w:pPr>
+        <w:ind w:left="720" w:hanging="360"/>
+      </w:pPr>
+      <w:rPr>
+        <w:rFonts w:ascii="Symbol" w:hAnsi="Symbol" w:hint="default"/>
+      </w:rPr>
+    </w:lvl>
+    <w:lvl w:ilvl="1" w:tplc="04090003" w:tentative="1">
+      <w:start w:val="1"/>
+      <w:numFmt w:val="bullet"/>
+      <w:lvlText w:val="o"/>
+      <w:lvlJc w:val="left"/>
+      <w:pPr>
+        <w:ind w:left="1440" w:hanging="360"/>
+      </w:pPr>
+      <w:rPr>
+        <w:rFonts w:ascii="Courier New" w:hAnsi="Courier New" w:cs="Courier New" w:hint="default"/>
+      </w:rPr>
+    </w:lvl>
+    <w:lvl w:ilvl="2" w:tplc="04090005" w:tentative="1">
+      <w:start w:val="1"/>
+      <w:numFmt w:val="bullet"/>
+      <w:lvlText w:val=""/>
+      <w:lvlJc w:val="left"/>
+      <w:pPr>
+        <w:ind w:left="2160" w:hanging="360"/>
+      </w:pPr>
+      <w:rPr>
+        <w:rFonts w:ascii="Wingdings" w:hAnsi="Wingdings" w:hint="default"/>
+      </w:rPr>
+    </w:lvl>
+    <w:lvl w:ilvl="3" w:tplc="04090001" w:tentative="1">
+      <w:start w:val="1"/>
+      <w:numFmt w:val="bullet"/>
+      <w:lvlText w:val=""/>
+      <w:lvlJc w:val="left"/>
+      <w:pPr>
+        <w:ind w:left="2880" w:hanging="360"/>
+      </w:pPr>
+      <w:rPr>
+        <w:rFonts w:ascii="Symbol" w:hAnsi="Symbol" w:hint="default"/>
+      </w:rPr>
+    </w:lvl>
+    <w:lvl w:ilvl="4" w:tplc="04090003" w:tentative="1">
+      <w:start w:val="1"/>
+      <w:numFmt w:val="bullet"/>
+      <w:lvlText w:val="o"/>
+      <w:lvlJc w:val="left"/>
+      <w:pPr>
+        <w:ind w:left="3600" w:hanging="360"/>
+      </w:pPr>
+      <w:rPr>
+        <w:rFonts w:ascii="Courier New" w:hAnsi="Courier New" w:cs="Courier New" w:hint="default"/>
+      </w:rPr>
+    </w:lvl>
+    <w:lvl w:ilvl="5" w:tplc="04090005" w:tentative="1">
+      <w:start w:val="1"/>
+      <w:numFmt w:val="bullet"/>
+      <w:lvlText w:val=""/>
+      <w:lvlJc w:val="left"/>
+      <w:pPr>
+        <w:ind w:left="4320" w:hanging="360"/>
+      </w:pPr>
+      <w:rPr>
+        <w:rFonts w:ascii="Wingdings" w:hAnsi="Wingdings" w:hint="default"/>
+      </w:rPr>
+    </w:lvl>
+    <w:lvl w:ilvl="6" w:tplc="04090001" w:tentative="1">
+      <w:start w:val="1"/>
+      <w:numFmt w:val="bullet"/>
+      <w:lvlText w:val=""/>
+      <w:lvlJc w:val="left"/>
+      <w:pPr>
+        <w:ind w:left="5040" w:hanging="360"/>
+      </w:pPr>
+      <w:rPr>
+        <w:rFonts w:ascii="Symbol" w:hAnsi="Symbol" w:hint="default"/>
+      </w:rPr>
+    </w:lvl>
+    <w:lvl w:ilvl="7" w:tplc="04090003" w:tentative="1">
+      <w:start w:val="1"/>
+      <w:numFmt w:val="bullet"/>
+      <w:lvlText w:val="o"/>
+      <w:lvlJc w:val="left"/>
+      <w:pPr>
+        <w:ind w:left="5760" w:hanging="360"/>
+      </w:pPr>
+      <w:rPr>
+        <w:rFonts w:ascii="Courier New" w:hAnsi="Courier New" w:cs="Courier New" w:hint="default"/>
+      </w:rPr>
+    </w:lvl>
+    <w:lvl w:ilvl="8" w:tplc="04090005" w:tentative="1">
+      <w:start w:val="1"/>
+      <w:numFmt w:val="bullet"/>
+      <w:lvlText w:val=""/>
+      <w:lvlJc w:val="left"/>
+      <w:pPr>
+        <w:ind w:left="6480" w:hanging="360"/>
+      </w:pPr>
+      <w:rPr>
+        <w:rFonts w:ascii="Wingdings" w:hAnsi="Wingdings" w:hint="default"/>
+      </w:rPr>
+    </w:lvl>
+  </w:abstractNum>
+  <w:abstractNum w:abstractNumId="1" w15:restartNumberingAfterBreak="0">
     <w:nsid w:val="02A65BEB"/>
     <w:multiLevelType w:val="hybridMultilevel"/>
     <w:tmpl w:val="0A6E9EFC"/>
@@ -7599,7 +8988,7 @@
       </w:rPr>
     </w:lvl>
   </w:abstractNum>
-  <w:abstractNum w:abstractNumId="1" w15:restartNumberingAfterBreak="0">
+  <w:abstractNum w:abstractNumId="2" w15:restartNumberingAfterBreak="0">
     <w:nsid w:val="03E05674"/>
     <w:multiLevelType w:val="hybridMultilevel"/>
     <w:tmpl w:val="5A944142"/>
@@ -7712,7 +9101,7 @@
       </w:rPr>
     </w:lvl>
   </w:abstractNum>
-  <w:abstractNum w:abstractNumId="2" w15:restartNumberingAfterBreak="0">
+  <w:abstractNum w:abstractNumId="3" w15:restartNumberingAfterBreak="0">
     <w:nsid w:val="0637248A"/>
     <w:multiLevelType w:val="hybridMultilevel"/>
     <w:tmpl w:val="D69A594A"/>
@@ -7825,7 +9214,7 @@
       </w:rPr>
     </w:lvl>
   </w:abstractNum>
-  <w:abstractNum w:abstractNumId="3" w15:restartNumberingAfterBreak="0">
+  <w:abstractNum w:abstractNumId="4" w15:restartNumberingAfterBreak="0">
     <w:nsid w:val="06BF6FBB"/>
     <w:multiLevelType w:val="hybridMultilevel"/>
     <w:tmpl w:val="4A587574"/>
@@ -7938,7 +9327,7 @@
       </w:rPr>
     </w:lvl>
   </w:abstractNum>
-  <w:abstractNum w:abstractNumId="4" w15:restartNumberingAfterBreak="0">
+  <w:abstractNum w:abstractNumId="5" w15:restartNumberingAfterBreak="0">
     <w:nsid w:val="06FE797A"/>
     <w:multiLevelType w:val="hybridMultilevel"/>
     <w:tmpl w:val="02B07E38"/>
@@ -8051,7 +9440,7 @@
       </w:rPr>
     </w:lvl>
   </w:abstractNum>
-  <w:abstractNum w:abstractNumId="5" w15:restartNumberingAfterBreak="0">
+  <w:abstractNum w:abstractNumId="6" w15:restartNumberingAfterBreak="0">
     <w:nsid w:val="09930DCB"/>
     <w:multiLevelType w:val="hybridMultilevel"/>
     <w:tmpl w:val="B3822F4E"/>
@@ -8164,7 +9553,7 @@
       </w:rPr>
     </w:lvl>
   </w:abstractNum>
-  <w:abstractNum w:abstractNumId="6" w15:restartNumberingAfterBreak="0">
+  <w:abstractNum w:abstractNumId="7" w15:restartNumberingAfterBreak="0">
     <w:nsid w:val="09DF4F95"/>
     <w:multiLevelType w:val="hybridMultilevel"/>
     <w:tmpl w:val="E3FCDC46"/>
@@ -8277,7 +9666,7 @@
       </w:rPr>
     </w:lvl>
   </w:abstractNum>
-  <w:abstractNum w:abstractNumId="7" w15:restartNumberingAfterBreak="0">
+  <w:abstractNum w:abstractNumId="8" w15:restartNumberingAfterBreak="0">
     <w:nsid w:val="0B346B46"/>
     <w:multiLevelType w:val="hybridMultilevel"/>
     <w:tmpl w:val="5FB2CE5A"/>
@@ -8390,7 +9779,7 @@
       </w:rPr>
     </w:lvl>
   </w:abstractNum>
-  <w:abstractNum w:abstractNumId="8" w15:restartNumberingAfterBreak="0">
+  <w:abstractNum w:abstractNumId="9" w15:restartNumberingAfterBreak="0">
     <w:nsid w:val="10204633"/>
     <w:multiLevelType w:val="hybridMultilevel"/>
     <w:tmpl w:val="B9FEB98A"/>
@@ -8503,7 +9892,7 @@
       </w:rPr>
     </w:lvl>
   </w:abstractNum>
-  <w:abstractNum w:abstractNumId="9" w15:restartNumberingAfterBreak="0">
+  <w:abstractNum w:abstractNumId="10" w15:restartNumberingAfterBreak="0">
     <w:nsid w:val="11CA36C1"/>
     <w:multiLevelType w:val="hybridMultilevel"/>
     <w:tmpl w:val="AE64CAE2"/>
@@ -8616,7 +10005,7 @@
       </w:rPr>
     </w:lvl>
   </w:abstractNum>
-  <w:abstractNum w:abstractNumId="10" w15:restartNumberingAfterBreak="0">
+  <w:abstractNum w:abstractNumId="11" w15:restartNumberingAfterBreak="0">
     <w:nsid w:val="12266F25"/>
     <w:multiLevelType w:val="hybridMultilevel"/>
     <w:tmpl w:val="5B9A7764"/>
@@ -8729,7 +10118,7 @@
       </w:rPr>
     </w:lvl>
   </w:abstractNum>
-  <w:abstractNum w:abstractNumId="11" w15:restartNumberingAfterBreak="0">
+  <w:abstractNum w:abstractNumId="12" w15:restartNumberingAfterBreak="0">
     <w:nsid w:val="145A0748"/>
     <w:multiLevelType w:val="hybridMultilevel"/>
     <w:tmpl w:val="0832E8FC"/>
@@ -8842,7 +10231,7 @@
       </w:rPr>
     </w:lvl>
   </w:abstractNum>
-  <w:abstractNum w:abstractNumId="12" w15:restartNumberingAfterBreak="0">
+  <w:abstractNum w:abstractNumId="13" w15:restartNumberingAfterBreak="0">
     <w:nsid w:val="14EE32B3"/>
     <w:multiLevelType w:val="hybridMultilevel"/>
     <w:tmpl w:val="AC5CDCC6"/>
@@ -8955,7 +10344,7 @@
       </w:rPr>
     </w:lvl>
   </w:abstractNum>
-  <w:abstractNum w:abstractNumId="13" w15:restartNumberingAfterBreak="0">
+  <w:abstractNum w:abstractNumId="14" w15:restartNumberingAfterBreak="0">
     <w:nsid w:val="15E7021E"/>
     <w:multiLevelType w:val="hybridMultilevel"/>
     <w:tmpl w:val="F046498C"/>
@@ -9068,7 +10457,7 @@
       </w:rPr>
     </w:lvl>
   </w:abstractNum>
-  <w:abstractNum w:abstractNumId="14" w15:restartNumberingAfterBreak="0">
+  <w:abstractNum w:abstractNumId="15" w15:restartNumberingAfterBreak="0">
     <w:nsid w:val="164E6E3D"/>
     <w:multiLevelType w:val="hybridMultilevel"/>
     <w:tmpl w:val="CDD4DAAA"/>
@@ -9181,7 +10570,7 @@
       </w:rPr>
     </w:lvl>
   </w:abstractNum>
-  <w:abstractNum w:abstractNumId="15" w15:restartNumberingAfterBreak="0">
+  <w:abstractNum w:abstractNumId="16" w15:restartNumberingAfterBreak="0">
     <w:nsid w:val="169F0D15"/>
     <w:multiLevelType w:val="hybridMultilevel"/>
     <w:tmpl w:val="A9B2BA0C"/>
@@ -9294,7 +10683,7 @@
       </w:rPr>
     </w:lvl>
   </w:abstractNum>
-  <w:abstractNum w:abstractNumId="16" w15:restartNumberingAfterBreak="0">
+  <w:abstractNum w:abstractNumId="17" w15:restartNumberingAfterBreak="0">
     <w:nsid w:val="16E745ED"/>
     <w:multiLevelType w:val="hybridMultilevel"/>
     <w:tmpl w:val="CF440F36"/>
@@ -9407,7 +10796,7 @@
       </w:rPr>
     </w:lvl>
   </w:abstractNum>
-  <w:abstractNum w:abstractNumId="17" w15:restartNumberingAfterBreak="0">
+  <w:abstractNum w:abstractNumId="18" w15:restartNumberingAfterBreak="0">
     <w:nsid w:val="170F5551"/>
     <w:multiLevelType w:val="hybridMultilevel"/>
     <w:tmpl w:val="93164818"/>
@@ -9520,7 +10909,7 @@
       </w:rPr>
     </w:lvl>
   </w:abstractNum>
-  <w:abstractNum w:abstractNumId="18" w15:restartNumberingAfterBreak="0">
+  <w:abstractNum w:abstractNumId="19" w15:restartNumberingAfterBreak="0">
     <w:nsid w:val="175F4A75"/>
     <w:multiLevelType w:val="hybridMultilevel"/>
     <w:tmpl w:val="3FC6F61A"/>
@@ -9633,7 +11022,7 @@
       </w:rPr>
     </w:lvl>
   </w:abstractNum>
-  <w:abstractNum w:abstractNumId="19" w15:restartNumberingAfterBreak="0">
+  <w:abstractNum w:abstractNumId="20" w15:restartNumberingAfterBreak="0">
     <w:nsid w:val="190B7B97"/>
     <w:multiLevelType w:val="hybridMultilevel"/>
     <w:tmpl w:val="E51E59F6"/>
@@ -9746,10 +11135,10 @@
       </w:rPr>
     </w:lvl>
   </w:abstractNum>
-  <w:abstractNum w:abstractNumId="20" w15:restartNumberingAfterBreak="0">
+  <w:abstractNum w:abstractNumId="21" w15:restartNumberingAfterBreak="0">
     <w:nsid w:val="1C291036"/>
     <w:multiLevelType w:val="hybridMultilevel"/>
-    <w:tmpl w:val="38CE8EA6"/>
+    <w:tmpl w:val="1298BA4A"/>
     <w:lvl w:ilvl="0" w:tplc="04090001">
       <w:start w:val="1"/>
       <w:numFmt w:val="bullet"/>
@@ -9859,7 +11248,7 @@
       </w:rPr>
     </w:lvl>
   </w:abstractNum>
-  <w:abstractNum w:abstractNumId="21" w15:restartNumberingAfterBreak="0">
+  <w:abstractNum w:abstractNumId="22" w15:restartNumberingAfterBreak="0">
     <w:nsid w:val="1D614326"/>
     <w:multiLevelType w:val="hybridMultilevel"/>
     <w:tmpl w:val="9A4255CE"/>
@@ -9972,7 +11361,7 @@
       </w:rPr>
     </w:lvl>
   </w:abstractNum>
-  <w:abstractNum w:abstractNumId="22" w15:restartNumberingAfterBreak="0">
+  <w:abstractNum w:abstractNumId="23" w15:restartNumberingAfterBreak="0">
     <w:nsid w:val="1E972DE3"/>
     <w:multiLevelType w:val="hybridMultilevel"/>
     <w:tmpl w:val="7590B2BA"/>
@@ -10085,7 +11474,7 @@
       </w:rPr>
     </w:lvl>
   </w:abstractNum>
-  <w:abstractNum w:abstractNumId="23" w15:restartNumberingAfterBreak="0">
+  <w:abstractNum w:abstractNumId="24" w15:restartNumberingAfterBreak="0">
     <w:nsid w:val="208017BB"/>
     <w:multiLevelType w:val="hybridMultilevel"/>
     <w:tmpl w:val="31887F74"/>
@@ -10198,7 +11587,7 @@
       </w:rPr>
     </w:lvl>
   </w:abstractNum>
-  <w:abstractNum w:abstractNumId="24" w15:restartNumberingAfterBreak="0">
+  <w:abstractNum w:abstractNumId="25" w15:restartNumberingAfterBreak="0">
     <w:nsid w:val="22F66F0C"/>
     <w:multiLevelType w:val="hybridMultilevel"/>
     <w:tmpl w:val="C0C03F0A"/>
@@ -10311,7 +11700,7 @@
       </w:rPr>
     </w:lvl>
   </w:abstractNum>
-  <w:abstractNum w:abstractNumId="25" w15:restartNumberingAfterBreak="0">
+  <w:abstractNum w:abstractNumId="26" w15:restartNumberingAfterBreak="0">
     <w:nsid w:val="2A803D23"/>
     <w:multiLevelType w:val="hybridMultilevel"/>
     <w:tmpl w:val="76D0AB70"/>
@@ -10424,7 +11813,7 @@
       </w:rPr>
     </w:lvl>
   </w:abstractNum>
-  <w:abstractNum w:abstractNumId="26" w15:restartNumberingAfterBreak="0">
+  <w:abstractNum w:abstractNumId="27" w15:restartNumberingAfterBreak="0">
     <w:nsid w:val="2F465F72"/>
     <w:multiLevelType w:val="hybridMultilevel"/>
     <w:tmpl w:val="F204427C"/>
@@ -10537,7 +11926,7 @@
       </w:rPr>
     </w:lvl>
   </w:abstractNum>
-  <w:abstractNum w:abstractNumId="27" w15:restartNumberingAfterBreak="0">
+  <w:abstractNum w:abstractNumId="28" w15:restartNumberingAfterBreak="0">
     <w:nsid w:val="33144E51"/>
     <w:multiLevelType w:val="hybridMultilevel"/>
     <w:tmpl w:val="587C2A30"/>
@@ -10650,7 +12039,7 @@
       </w:rPr>
     </w:lvl>
   </w:abstractNum>
-  <w:abstractNum w:abstractNumId="28" w15:restartNumberingAfterBreak="0">
+  <w:abstractNum w:abstractNumId="29" w15:restartNumberingAfterBreak="0">
     <w:nsid w:val="372C5BE8"/>
     <w:multiLevelType w:val="hybridMultilevel"/>
     <w:tmpl w:val="9E26AE30"/>
@@ -10763,7 +12152,7 @@
       </w:rPr>
     </w:lvl>
   </w:abstractNum>
-  <w:abstractNum w:abstractNumId="29" w15:restartNumberingAfterBreak="0">
+  <w:abstractNum w:abstractNumId="30" w15:restartNumberingAfterBreak="0">
     <w:nsid w:val="3743402B"/>
     <w:multiLevelType w:val="hybridMultilevel"/>
     <w:tmpl w:val="C902D9CE"/>
@@ -10876,7 +12265,7 @@
       </w:rPr>
     </w:lvl>
   </w:abstractNum>
-  <w:abstractNum w:abstractNumId="30" w15:restartNumberingAfterBreak="0">
+  <w:abstractNum w:abstractNumId="31" w15:restartNumberingAfterBreak="0">
     <w:nsid w:val="375D263B"/>
     <w:multiLevelType w:val="hybridMultilevel"/>
     <w:tmpl w:val="8344651E"/>
@@ -10989,7 +12378,7 @@
       </w:rPr>
     </w:lvl>
   </w:abstractNum>
-  <w:abstractNum w:abstractNumId="31" w15:restartNumberingAfterBreak="0">
+  <w:abstractNum w:abstractNumId="32" w15:restartNumberingAfterBreak="0">
     <w:nsid w:val="38501CA3"/>
     <w:multiLevelType w:val="hybridMultilevel"/>
     <w:tmpl w:val="A8FEB93E"/>
@@ -11102,7 +12491,120 @@
       </w:rPr>
     </w:lvl>
   </w:abstractNum>
-  <w:abstractNum w:abstractNumId="32" w15:restartNumberingAfterBreak="0">
+  <w:abstractNum w:abstractNumId="33" w15:restartNumberingAfterBreak="0">
+    <w:nsid w:val="393911D0"/>
+    <w:multiLevelType w:val="hybridMultilevel"/>
+    <w:tmpl w:val="3642D74C"/>
+    <w:lvl w:ilvl="0" w:tplc="04090001">
+      <w:start w:val="1"/>
+      <w:numFmt w:val="bullet"/>
+      <w:lvlText w:val=""/>
+      <w:lvlJc w:val="left"/>
+      <w:pPr>
+        <w:ind w:left="720" w:hanging="360"/>
+      </w:pPr>
+      <w:rPr>
+        <w:rFonts w:ascii="Symbol" w:hAnsi="Symbol" w:hint="default"/>
+      </w:rPr>
+    </w:lvl>
+    <w:lvl w:ilvl="1" w:tplc="04090003" w:tentative="1">
+      <w:start w:val="1"/>
+      <w:numFmt w:val="bullet"/>
+      <w:lvlText w:val="o"/>
+      <w:lvlJc w:val="left"/>
+      <w:pPr>
+        <w:ind w:left="1440" w:hanging="360"/>
+      </w:pPr>
+      <w:rPr>
+        <w:rFonts w:ascii="Courier New" w:hAnsi="Courier New" w:cs="Courier New" w:hint="default"/>
+      </w:rPr>
+    </w:lvl>
+    <w:lvl w:ilvl="2" w:tplc="04090005" w:tentative="1">
+      <w:start w:val="1"/>
+      <w:numFmt w:val="bullet"/>
+      <w:lvlText w:val=""/>
+      <w:lvlJc w:val="left"/>
+      <w:pPr>
+        <w:ind w:left="2160" w:hanging="360"/>
+      </w:pPr>
+      <w:rPr>
+        <w:rFonts w:ascii="Wingdings" w:hAnsi="Wingdings" w:hint="default"/>
+      </w:rPr>
+    </w:lvl>
+    <w:lvl w:ilvl="3" w:tplc="04090001" w:tentative="1">
+      <w:start w:val="1"/>
+      <w:numFmt w:val="bullet"/>
+      <w:lvlText w:val=""/>
+      <w:lvlJc w:val="left"/>
+      <w:pPr>
+        <w:ind w:left="2880" w:hanging="360"/>
+      </w:pPr>
+      <w:rPr>
+        <w:rFonts w:ascii="Symbol" w:hAnsi="Symbol" w:hint="default"/>
+      </w:rPr>
+    </w:lvl>
+    <w:lvl w:ilvl="4" w:tplc="04090003" w:tentative="1">
+      <w:start w:val="1"/>
+      <w:numFmt w:val="bullet"/>
+      <w:lvlText w:val="o"/>
+      <w:lvlJc w:val="left"/>
+      <w:pPr>
+        <w:ind w:left="3600" w:hanging="360"/>
+      </w:pPr>
+      <w:rPr>
+        <w:rFonts w:ascii="Courier New" w:hAnsi="Courier New" w:cs="Courier New" w:hint="default"/>
+      </w:rPr>
+    </w:lvl>
+    <w:lvl w:ilvl="5" w:tplc="04090005" w:tentative="1">
+      <w:start w:val="1"/>
+      <w:numFmt w:val="bullet"/>
+      <w:lvlText w:val=""/>
+      <w:lvlJc w:val="left"/>
+      <w:pPr>
+        <w:ind w:left="4320" w:hanging="360"/>
+      </w:pPr>
+      <w:rPr>
+        <w:rFonts w:ascii="Wingdings" w:hAnsi="Wingdings" w:hint="default"/>
+      </w:rPr>
+    </w:lvl>
+    <w:lvl w:ilvl="6" w:tplc="04090001" w:tentative="1">
+      <w:start w:val="1"/>
+      <w:numFmt w:val="bullet"/>
+      <w:lvlText w:val=""/>
+      <w:lvlJc w:val="left"/>
+      <w:pPr>
+        <w:ind w:left="5040" w:hanging="360"/>
+      </w:pPr>
+      <w:rPr>
+        <w:rFonts w:ascii="Symbol" w:hAnsi="Symbol" w:hint="default"/>
+      </w:rPr>
+    </w:lvl>
+    <w:lvl w:ilvl="7" w:tplc="04090003" w:tentative="1">
+      <w:start w:val="1"/>
+      <w:numFmt w:val="bullet"/>
+      <w:lvlText w:val="o"/>
+      <w:lvlJc w:val="left"/>
+      <w:pPr>
+        <w:ind w:left="5760" w:hanging="360"/>
+      </w:pPr>
+      <w:rPr>
+        <w:rFonts w:ascii="Courier New" w:hAnsi="Courier New" w:cs="Courier New" w:hint="default"/>
+      </w:rPr>
+    </w:lvl>
+    <w:lvl w:ilvl="8" w:tplc="04090005" w:tentative="1">
+      <w:start w:val="1"/>
+      <w:numFmt w:val="bullet"/>
+      <w:lvlText w:val=""/>
+      <w:lvlJc w:val="left"/>
+      <w:pPr>
+        <w:ind w:left="6480" w:hanging="360"/>
+      </w:pPr>
+      <w:rPr>
+        <w:rFonts w:ascii="Wingdings" w:hAnsi="Wingdings" w:hint="default"/>
+      </w:rPr>
+    </w:lvl>
+  </w:abstractNum>
+  <w:abstractNum w:abstractNumId="34" w15:restartNumberingAfterBreak="0">
     <w:nsid w:val="394F4036"/>
     <w:multiLevelType w:val="hybridMultilevel"/>
     <w:tmpl w:val="3ECA1C3A"/>
@@ -11215,7 +12717,120 @@
       </w:rPr>
     </w:lvl>
   </w:abstractNum>
-  <w:abstractNum w:abstractNumId="33" w15:restartNumberingAfterBreak="0">
+  <w:abstractNum w:abstractNumId="35" w15:restartNumberingAfterBreak="0">
+    <w:nsid w:val="39913302"/>
+    <w:multiLevelType w:val="hybridMultilevel"/>
+    <w:tmpl w:val="E424FD7A"/>
+    <w:lvl w:ilvl="0" w:tplc="04090001">
+      <w:start w:val="1"/>
+      <w:numFmt w:val="bullet"/>
+      <w:lvlText w:val=""/>
+      <w:lvlJc w:val="left"/>
+      <w:pPr>
+        <w:ind w:left="720" w:hanging="360"/>
+      </w:pPr>
+      <w:rPr>
+        <w:rFonts w:ascii="Symbol" w:hAnsi="Symbol" w:hint="default"/>
+      </w:rPr>
+    </w:lvl>
+    <w:lvl w:ilvl="1" w:tplc="04090003" w:tentative="1">
+      <w:start w:val="1"/>
+      <w:numFmt w:val="bullet"/>
+      <w:lvlText w:val="o"/>
+      <w:lvlJc w:val="left"/>
+      <w:pPr>
+        <w:ind w:left="1440" w:hanging="360"/>
+      </w:pPr>
+      <w:rPr>
+        <w:rFonts w:ascii="Courier New" w:hAnsi="Courier New" w:cs="Courier New" w:hint="default"/>
+      </w:rPr>
+    </w:lvl>
+    <w:lvl w:ilvl="2" w:tplc="04090005" w:tentative="1">
+      <w:start w:val="1"/>
+      <w:numFmt w:val="bullet"/>
+      <w:lvlText w:val=""/>
+      <w:lvlJc w:val="left"/>
+      <w:pPr>
+        <w:ind w:left="2160" w:hanging="360"/>
+      </w:pPr>
+      <w:rPr>
+        <w:rFonts w:ascii="Wingdings" w:hAnsi="Wingdings" w:hint="default"/>
+      </w:rPr>
+    </w:lvl>
+    <w:lvl w:ilvl="3" w:tplc="04090001" w:tentative="1">
+      <w:start w:val="1"/>
+      <w:numFmt w:val="bullet"/>
+      <w:lvlText w:val=""/>
+      <w:lvlJc w:val="left"/>
+      <w:pPr>
+        <w:ind w:left="2880" w:hanging="360"/>
+      </w:pPr>
+      <w:rPr>
+        <w:rFonts w:ascii="Symbol" w:hAnsi="Symbol" w:hint="default"/>
+      </w:rPr>
+    </w:lvl>
+    <w:lvl w:ilvl="4" w:tplc="04090003" w:tentative="1">
+      <w:start w:val="1"/>
+      <w:numFmt w:val="bullet"/>
+      <w:lvlText w:val="o"/>
+      <w:lvlJc w:val="left"/>
+      <w:pPr>
+        <w:ind w:left="3600" w:hanging="360"/>
+      </w:pPr>
+      <w:rPr>
+        <w:rFonts w:ascii="Courier New" w:hAnsi="Courier New" w:cs="Courier New" w:hint="default"/>
+      </w:rPr>
+    </w:lvl>
+    <w:lvl w:ilvl="5" w:tplc="04090005" w:tentative="1">
+      <w:start w:val="1"/>
+      <w:numFmt w:val="bullet"/>
+      <w:lvlText w:val=""/>
+      <w:lvlJc w:val="left"/>
+      <w:pPr>
+        <w:ind w:left="4320" w:hanging="360"/>
+      </w:pPr>
+      <w:rPr>
+        <w:rFonts w:ascii="Wingdings" w:hAnsi="Wingdings" w:hint="default"/>
+      </w:rPr>
+    </w:lvl>
+    <w:lvl w:ilvl="6" w:tplc="04090001" w:tentative="1">
+      <w:start w:val="1"/>
+      <w:numFmt w:val="bullet"/>
+      <w:lvlText w:val=""/>
+      <w:lvlJc w:val="left"/>
+      <w:pPr>
+        <w:ind w:left="5040" w:hanging="360"/>
+      </w:pPr>
+      <w:rPr>
+        <w:rFonts w:ascii="Symbol" w:hAnsi="Symbol" w:hint="default"/>
+      </w:rPr>
+    </w:lvl>
+    <w:lvl w:ilvl="7" w:tplc="04090003" w:tentative="1">
+      <w:start w:val="1"/>
+      <w:numFmt w:val="bullet"/>
+      <w:lvlText w:val="o"/>
+      <w:lvlJc w:val="left"/>
+      <w:pPr>
+        <w:ind w:left="5760" w:hanging="360"/>
+      </w:pPr>
+      <w:rPr>
+        <w:rFonts w:ascii="Courier New" w:hAnsi="Courier New" w:cs="Courier New" w:hint="default"/>
+      </w:rPr>
+    </w:lvl>
+    <w:lvl w:ilvl="8" w:tplc="04090005" w:tentative="1">
+      <w:start w:val="1"/>
+      <w:numFmt w:val="bullet"/>
+      <w:lvlText w:val=""/>
+      <w:lvlJc w:val="left"/>
+      <w:pPr>
+        <w:ind w:left="6480" w:hanging="360"/>
+      </w:pPr>
+      <w:rPr>
+        <w:rFonts w:ascii="Wingdings" w:hAnsi="Wingdings" w:hint="default"/>
+      </w:rPr>
+    </w:lvl>
+  </w:abstractNum>
+  <w:abstractNum w:abstractNumId="36" w15:restartNumberingAfterBreak="0">
     <w:nsid w:val="3ABD1D76"/>
     <w:multiLevelType w:val="hybridMultilevel"/>
     <w:tmpl w:val="8FB457AE"/>
@@ -11328,7 +12943,7 @@
       </w:rPr>
     </w:lvl>
   </w:abstractNum>
-  <w:abstractNum w:abstractNumId="34" w15:restartNumberingAfterBreak="0">
+  <w:abstractNum w:abstractNumId="37" w15:restartNumberingAfterBreak="0">
     <w:nsid w:val="3B392969"/>
     <w:multiLevelType w:val="hybridMultilevel"/>
     <w:tmpl w:val="2A42AB2A"/>
@@ -11441,7 +13056,120 @@
       </w:rPr>
     </w:lvl>
   </w:abstractNum>
-  <w:abstractNum w:abstractNumId="35" w15:restartNumberingAfterBreak="0">
+  <w:abstractNum w:abstractNumId="38" w15:restartNumberingAfterBreak="0">
+    <w:nsid w:val="3C0E20AB"/>
+    <w:multiLevelType w:val="hybridMultilevel"/>
+    <w:tmpl w:val="062C33F0"/>
+    <w:lvl w:ilvl="0" w:tplc="04090001">
+      <w:start w:val="1"/>
+      <w:numFmt w:val="bullet"/>
+      <w:lvlText w:val=""/>
+      <w:lvlJc w:val="left"/>
+      <w:pPr>
+        <w:ind w:left="720" w:hanging="360"/>
+      </w:pPr>
+      <w:rPr>
+        <w:rFonts w:ascii="Symbol" w:hAnsi="Symbol" w:hint="default"/>
+      </w:rPr>
+    </w:lvl>
+    <w:lvl w:ilvl="1" w:tplc="04090003" w:tentative="1">
+      <w:start w:val="1"/>
+      <w:numFmt w:val="bullet"/>
+      <w:lvlText w:val="o"/>
+      <w:lvlJc w:val="left"/>
+      <w:pPr>
+        <w:ind w:left="1440" w:hanging="360"/>
+      </w:pPr>
+      <w:rPr>
+        <w:rFonts w:ascii="Courier New" w:hAnsi="Courier New" w:cs="Courier New" w:hint="default"/>
+      </w:rPr>
+    </w:lvl>
+    <w:lvl w:ilvl="2" w:tplc="04090005" w:tentative="1">
+      <w:start w:val="1"/>
+      <w:numFmt w:val="bullet"/>
+      <w:lvlText w:val=""/>
+      <w:lvlJc w:val="left"/>
+      <w:pPr>
+        <w:ind w:left="2160" w:hanging="360"/>
+      </w:pPr>
+      <w:rPr>
+        <w:rFonts w:ascii="Wingdings" w:hAnsi="Wingdings" w:hint="default"/>
+      </w:rPr>
+    </w:lvl>
+    <w:lvl w:ilvl="3" w:tplc="04090001" w:tentative="1">
+      <w:start w:val="1"/>
+      <w:numFmt w:val="bullet"/>
+      <w:lvlText w:val=""/>
+      <w:lvlJc w:val="left"/>
+      <w:pPr>
+        <w:ind w:left="2880" w:hanging="360"/>
+      </w:pPr>
+      <w:rPr>
+        <w:rFonts w:ascii="Symbol" w:hAnsi="Symbol" w:hint="default"/>
+      </w:rPr>
+    </w:lvl>
+    <w:lvl w:ilvl="4" w:tplc="04090003" w:tentative="1">
+      <w:start w:val="1"/>
+      <w:numFmt w:val="bullet"/>
+      <w:lvlText w:val="o"/>
+      <w:lvlJc w:val="left"/>
+      <w:pPr>
+        <w:ind w:left="3600" w:hanging="360"/>
+      </w:pPr>
+      <w:rPr>
+        <w:rFonts w:ascii="Courier New" w:hAnsi="Courier New" w:cs="Courier New" w:hint="default"/>
+      </w:rPr>
+    </w:lvl>
+    <w:lvl w:ilvl="5" w:tplc="04090005" w:tentative="1">
+      <w:start w:val="1"/>
+      <w:numFmt w:val="bullet"/>
+      <w:lvlText w:val=""/>
+      <w:lvlJc w:val="left"/>
+      <w:pPr>
+        <w:ind w:left="4320" w:hanging="360"/>
+      </w:pPr>
+      <w:rPr>
+        <w:rFonts w:ascii="Wingdings" w:hAnsi="Wingdings" w:hint="default"/>
+      </w:rPr>
+    </w:lvl>
+    <w:lvl w:ilvl="6" w:tplc="04090001" w:tentative="1">
+      <w:start w:val="1"/>
+      <w:numFmt w:val="bullet"/>
+      <w:lvlText w:val=""/>
+      <w:lvlJc w:val="left"/>
+      <w:pPr>
+        <w:ind w:left="5040" w:hanging="360"/>
+      </w:pPr>
+      <w:rPr>
+        <w:rFonts w:ascii="Symbol" w:hAnsi="Symbol" w:hint="default"/>
+      </w:rPr>
+    </w:lvl>
+    <w:lvl w:ilvl="7" w:tplc="04090003" w:tentative="1">
+      <w:start w:val="1"/>
+      <w:numFmt w:val="bullet"/>
+      <w:lvlText w:val="o"/>
+      <w:lvlJc w:val="left"/>
+      <w:pPr>
+        <w:ind w:left="5760" w:hanging="360"/>
+      </w:pPr>
+      <w:rPr>
+        <w:rFonts w:ascii="Courier New" w:hAnsi="Courier New" w:cs="Courier New" w:hint="default"/>
+      </w:rPr>
+    </w:lvl>
+    <w:lvl w:ilvl="8" w:tplc="04090005" w:tentative="1">
+      <w:start w:val="1"/>
+      <w:numFmt w:val="bullet"/>
+      <w:lvlText w:val=""/>
+      <w:lvlJc w:val="left"/>
+      <w:pPr>
+        <w:ind w:left="6480" w:hanging="360"/>
+      </w:pPr>
+      <w:rPr>
+        <w:rFonts w:ascii="Wingdings" w:hAnsi="Wingdings" w:hint="default"/>
+      </w:rPr>
+    </w:lvl>
+  </w:abstractNum>
+  <w:abstractNum w:abstractNumId="39" w15:restartNumberingAfterBreak="0">
     <w:nsid w:val="3F7D637E"/>
     <w:multiLevelType w:val="hybridMultilevel"/>
     <w:tmpl w:val="274E5BF2"/>
@@ -11554,7 +13282,233 @@
       </w:rPr>
     </w:lvl>
   </w:abstractNum>
-  <w:abstractNum w:abstractNumId="36" w15:restartNumberingAfterBreak="0">
+  <w:abstractNum w:abstractNumId="40" w15:restartNumberingAfterBreak="0">
+    <w:nsid w:val="400416A1"/>
+    <w:multiLevelType w:val="hybridMultilevel"/>
+    <w:tmpl w:val="A84AD150"/>
+    <w:lvl w:ilvl="0" w:tplc="04090001">
+      <w:start w:val="1"/>
+      <w:numFmt w:val="bullet"/>
+      <w:lvlText w:val=""/>
+      <w:lvlJc w:val="left"/>
+      <w:pPr>
+        <w:ind w:left="720" w:hanging="360"/>
+      </w:pPr>
+      <w:rPr>
+        <w:rFonts w:ascii="Symbol" w:hAnsi="Symbol" w:hint="default"/>
+      </w:rPr>
+    </w:lvl>
+    <w:lvl w:ilvl="1" w:tplc="04090003" w:tentative="1">
+      <w:start w:val="1"/>
+      <w:numFmt w:val="bullet"/>
+      <w:lvlText w:val="o"/>
+      <w:lvlJc w:val="left"/>
+      <w:pPr>
+        <w:ind w:left="1440" w:hanging="360"/>
+      </w:pPr>
+      <w:rPr>
+        <w:rFonts w:ascii="Courier New" w:hAnsi="Courier New" w:cs="Courier New" w:hint="default"/>
+      </w:rPr>
+    </w:lvl>
+    <w:lvl w:ilvl="2" w:tplc="04090005" w:tentative="1">
+      <w:start w:val="1"/>
+      <w:numFmt w:val="bullet"/>
+      <w:lvlText w:val=""/>
+      <w:lvlJc w:val="left"/>
+      <w:pPr>
+        <w:ind w:left="2160" w:hanging="360"/>
+      </w:pPr>
+      <w:rPr>
+        <w:rFonts w:ascii="Wingdings" w:hAnsi="Wingdings" w:hint="default"/>
+      </w:rPr>
+    </w:lvl>
+    <w:lvl w:ilvl="3" w:tplc="04090001" w:tentative="1">
+      <w:start w:val="1"/>
+      <w:numFmt w:val="bullet"/>
+      <w:lvlText w:val=""/>
+      <w:lvlJc w:val="left"/>
+      <w:pPr>
+        <w:ind w:left="2880" w:hanging="360"/>
+      </w:pPr>
+      <w:rPr>
+        <w:rFonts w:ascii="Symbol" w:hAnsi="Symbol" w:hint="default"/>
+      </w:rPr>
+    </w:lvl>
+    <w:lvl w:ilvl="4" w:tplc="04090003" w:tentative="1">
+      <w:start w:val="1"/>
+      <w:numFmt w:val="bullet"/>
+      <w:lvlText w:val="o"/>
+      <w:lvlJc w:val="left"/>
+      <w:pPr>
+        <w:ind w:left="3600" w:hanging="360"/>
+      </w:pPr>
+      <w:rPr>
+        <w:rFonts w:ascii="Courier New" w:hAnsi="Courier New" w:cs="Courier New" w:hint="default"/>
+      </w:rPr>
+    </w:lvl>
+    <w:lvl w:ilvl="5" w:tplc="04090005" w:tentative="1">
+      <w:start w:val="1"/>
+      <w:numFmt w:val="bullet"/>
+      <w:lvlText w:val=""/>
+      <w:lvlJc w:val="left"/>
+      <w:pPr>
+        <w:ind w:left="4320" w:hanging="360"/>
+      </w:pPr>
+      <w:rPr>
+        <w:rFonts w:ascii="Wingdings" w:hAnsi="Wingdings" w:hint="default"/>
+      </w:rPr>
+    </w:lvl>
+    <w:lvl w:ilvl="6" w:tplc="04090001" w:tentative="1">
+      <w:start w:val="1"/>
+      <w:numFmt w:val="bullet"/>
+      <w:lvlText w:val=""/>
+      <w:lvlJc w:val="left"/>
+      <w:pPr>
+        <w:ind w:left="5040" w:hanging="360"/>
+      </w:pPr>
+      <w:rPr>
+        <w:rFonts w:ascii="Symbol" w:hAnsi="Symbol" w:hint="default"/>
+      </w:rPr>
+    </w:lvl>
+    <w:lvl w:ilvl="7" w:tplc="04090003" w:tentative="1">
+      <w:start w:val="1"/>
+      <w:numFmt w:val="bullet"/>
+      <w:lvlText w:val="o"/>
+      <w:lvlJc w:val="left"/>
+      <w:pPr>
+        <w:ind w:left="5760" w:hanging="360"/>
+      </w:pPr>
+      <w:rPr>
+        <w:rFonts w:ascii="Courier New" w:hAnsi="Courier New" w:cs="Courier New" w:hint="default"/>
+      </w:rPr>
+    </w:lvl>
+    <w:lvl w:ilvl="8" w:tplc="04090005" w:tentative="1">
+      <w:start w:val="1"/>
+      <w:numFmt w:val="bullet"/>
+      <w:lvlText w:val=""/>
+      <w:lvlJc w:val="left"/>
+      <w:pPr>
+        <w:ind w:left="6480" w:hanging="360"/>
+      </w:pPr>
+      <w:rPr>
+        <w:rFonts w:ascii="Wingdings" w:hAnsi="Wingdings" w:hint="default"/>
+      </w:rPr>
+    </w:lvl>
+  </w:abstractNum>
+  <w:abstractNum w:abstractNumId="41" w15:restartNumberingAfterBreak="0">
+    <w:nsid w:val="409F5AD6"/>
+    <w:multiLevelType w:val="hybridMultilevel"/>
+    <w:tmpl w:val="0FEC56E2"/>
+    <w:lvl w:ilvl="0" w:tplc="04090001">
+      <w:start w:val="1"/>
+      <w:numFmt w:val="bullet"/>
+      <w:lvlText w:val=""/>
+      <w:lvlJc w:val="left"/>
+      <w:pPr>
+        <w:ind w:left="720" w:hanging="360"/>
+      </w:pPr>
+      <w:rPr>
+        <w:rFonts w:ascii="Symbol" w:hAnsi="Symbol" w:hint="default"/>
+      </w:rPr>
+    </w:lvl>
+    <w:lvl w:ilvl="1" w:tplc="04090003" w:tentative="1">
+      <w:start w:val="1"/>
+      <w:numFmt w:val="bullet"/>
+      <w:lvlText w:val="o"/>
+      <w:lvlJc w:val="left"/>
+      <w:pPr>
+        <w:ind w:left="1440" w:hanging="360"/>
+      </w:pPr>
+      <w:rPr>
+        <w:rFonts w:ascii="Courier New" w:hAnsi="Courier New" w:cs="Courier New" w:hint="default"/>
+      </w:rPr>
+    </w:lvl>
+    <w:lvl w:ilvl="2" w:tplc="04090005" w:tentative="1">
+      <w:start w:val="1"/>
+      <w:numFmt w:val="bullet"/>
+      <w:lvlText w:val=""/>
+      <w:lvlJc w:val="left"/>
+      <w:pPr>
+        <w:ind w:left="2160" w:hanging="360"/>
+      </w:pPr>
+      <w:rPr>
+        <w:rFonts w:ascii="Wingdings" w:hAnsi="Wingdings" w:hint="default"/>
+      </w:rPr>
+    </w:lvl>
+    <w:lvl w:ilvl="3" w:tplc="04090001" w:tentative="1">
+      <w:start w:val="1"/>
+      <w:numFmt w:val="bullet"/>
+      <w:lvlText w:val=""/>
+      <w:lvlJc w:val="left"/>
+      <w:pPr>
+        <w:ind w:left="2880" w:hanging="360"/>
+      </w:pPr>
+      <w:rPr>
+        <w:rFonts w:ascii="Symbol" w:hAnsi="Symbol" w:hint="default"/>
+      </w:rPr>
+    </w:lvl>
+    <w:lvl w:ilvl="4" w:tplc="04090003" w:tentative="1">
+      <w:start w:val="1"/>
+      <w:numFmt w:val="bullet"/>
+      <w:lvlText w:val="o"/>
+      <w:lvlJc w:val="left"/>
+      <w:pPr>
+        <w:ind w:left="3600" w:hanging="360"/>
+      </w:pPr>
+      <w:rPr>
+        <w:rFonts w:ascii="Courier New" w:hAnsi="Courier New" w:cs="Courier New" w:hint="default"/>
+      </w:rPr>
+    </w:lvl>
+    <w:lvl w:ilvl="5" w:tplc="04090005" w:tentative="1">
+      <w:start w:val="1"/>
+      <w:numFmt w:val="bullet"/>
+      <w:lvlText w:val=""/>
+      <w:lvlJc w:val="left"/>
+      <w:pPr>
+        <w:ind w:left="4320" w:hanging="360"/>
+      </w:pPr>
+      <w:rPr>
+        <w:rFonts w:ascii="Wingdings" w:hAnsi="Wingdings" w:hint="default"/>
+      </w:rPr>
+    </w:lvl>
+    <w:lvl w:ilvl="6" w:tplc="04090001" w:tentative="1">
+      <w:start w:val="1"/>
+      <w:numFmt w:val="bullet"/>
+      <w:lvlText w:val=""/>
+      <w:lvlJc w:val="left"/>
+      <w:pPr>
+        <w:ind w:left="5040" w:hanging="360"/>
+      </w:pPr>
+      <w:rPr>
+        <w:rFonts w:ascii="Symbol" w:hAnsi="Symbol" w:hint="default"/>
+      </w:rPr>
+    </w:lvl>
+    <w:lvl w:ilvl="7" w:tplc="04090003" w:tentative="1">
+      <w:start w:val="1"/>
+      <w:numFmt w:val="bullet"/>
+      <w:lvlText w:val="o"/>
+      <w:lvlJc w:val="left"/>
+      <w:pPr>
+        <w:ind w:left="5760" w:hanging="360"/>
+      </w:pPr>
+      <w:rPr>
+        <w:rFonts w:ascii="Courier New" w:hAnsi="Courier New" w:cs="Courier New" w:hint="default"/>
+      </w:rPr>
+    </w:lvl>
+    <w:lvl w:ilvl="8" w:tplc="04090005" w:tentative="1">
+      <w:start w:val="1"/>
+      <w:numFmt w:val="bullet"/>
+      <w:lvlText w:val=""/>
+      <w:lvlJc w:val="left"/>
+      <w:pPr>
+        <w:ind w:left="6480" w:hanging="360"/>
+      </w:pPr>
+      <w:rPr>
+        <w:rFonts w:ascii="Wingdings" w:hAnsi="Wingdings" w:hint="default"/>
+      </w:rPr>
+    </w:lvl>
+  </w:abstractNum>
+  <w:abstractNum w:abstractNumId="42" w15:restartNumberingAfterBreak="0">
     <w:nsid w:val="411F02A7"/>
     <w:multiLevelType w:val="hybridMultilevel"/>
     <w:tmpl w:val="5FAA57B0"/>
@@ -11667,7 +13621,7 @@
       </w:rPr>
     </w:lvl>
   </w:abstractNum>
-  <w:abstractNum w:abstractNumId="37" w15:restartNumberingAfterBreak="0">
+  <w:abstractNum w:abstractNumId="43" w15:restartNumberingAfterBreak="0">
     <w:nsid w:val="448A15B7"/>
     <w:multiLevelType w:val="hybridMultilevel"/>
     <w:tmpl w:val="BDC6CB2A"/>
@@ -11780,7 +13734,7 @@
       </w:rPr>
     </w:lvl>
   </w:abstractNum>
-  <w:abstractNum w:abstractNumId="38" w15:restartNumberingAfterBreak="0">
+  <w:abstractNum w:abstractNumId="44" w15:restartNumberingAfterBreak="0">
     <w:nsid w:val="45E23CDA"/>
     <w:multiLevelType w:val="hybridMultilevel"/>
     <w:tmpl w:val="FA427668"/>
@@ -11893,7 +13847,7 @@
       </w:rPr>
     </w:lvl>
   </w:abstractNum>
-  <w:abstractNum w:abstractNumId="39" w15:restartNumberingAfterBreak="0">
+  <w:abstractNum w:abstractNumId="45" w15:restartNumberingAfterBreak="0">
     <w:nsid w:val="465A1DED"/>
     <w:multiLevelType w:val="hybridMultilevel"/>
     <w:tmpl w:val="7D70C2CC"/>
@@ -11979,7 +13933,7 @@
       </w:pPr>
     </w:lvl>
   </w:abstractNum>
-  <w:abstractNum w:abstractNumId="40" w15:restartNumberingAfterBreak="0">
+  <w:abstractNum w:abstractNumId="46" w15:restartNumberingAfterBreak="0">
     <w:nsid w:val="470D7621"/>
     <w:multiLevelType w:val="hybridMultilevel"/>
     <w:tmpl w:val="BED6B3BE"/>
@@ -12092,7 +14046,7 @@
       </w:rPr>
     </w:lvl>
   </w:abstractNum>
-  <w:abstractNum w:abstractNumId="41" w15:restartNumberingAfterBreak="0">
+  <w:abstractNum w:abstractNumId="47" w15:restartNumberingAfterBreak="0">
     <w:nsid w:val="48940DBC"/>
     <w:multiLevelType w:val="hybridMultilevel"/>
     <w:tmpl w:val="1BD891DC"/>
@@ -12205,7 +14159,7 @@
       </w:rPr>
     </w:lvl>
   </w:abstractNum>
-  <w:abstractNum w:abstractNumId="42" w15:restartNumberingAfterBreak="0">
+  <w:abstractNum w:abstractNumId="48" w15:restartNumberingAfterBreak="0">
     <w:nsid w:val="48BF0869"/>
     <w:multiLevelType w:val="hybridMultilevel"/>
     <w:tmpl w:val="9006DACC"/>
@@ -12318,7 +14272,7 @@
       </w:rPr>
     </w:lvl>
   </w:abstractNum>
-  <w:abstractNum w:abstractNumId="43" w15:restartNumberingAfterBreak="0">
+  <w:abstractNum w:abstractNumId="49" w15:restartNumberingAfterBreak="0">
     <w:nsid w:val="49160F27"/>
     <w:multiLevelType w:val="hybridMultilevel"/>
     <w:tmpl w:val="DC8C739C"/>
@@ -12431,7 +14385,7 @@
       </w:rPr>
     </w:lvl>
   </w:abstractNum>
-  <w:abstractNum w:abstractNumId="44" w15:restartNumberingAfterBreak="0">
+  <w:abstractNum w:abstractNumId="50" w15:restartNumberingAfterBreak="0">
     <w:nsid w:val="4AE62B1C"/>
     <w:multiLevelType w:val="hybridMultilevel"/>
     <w:tmpl w:val="36E4591C"/>
@@ -12544,7 +14498,7 @@
       </w:rPr>
     </w:lvl>
   </w:abstractNum>
-  <w:abstractNum w:abstractNumId="45" w15:restartNumberingAfterBreak="0">
+  <w:abstractNum w:abstractNumId="51" w15:restartNumberingAfterBreak="0">
     <w:nsid w:val="4C9775C3"/>
     <w:multiLevelType w:val="hybridMultilevel"/>
     <w:tmpl w:val="24A425EE"/>
@@ -12657,7 +14611,120 @@
       </w:rPr>
     </w:lvl>
   </w:abstractNum>
-  <w:abstractNum w:abstractNumId="46" w15:restartNumberingAfterBreak="0">
+  <w:abstractNum w:abstractNumId="52" w15:restartNumberingAfterBreak="0">
+    <w:nsid w:val="4CBF6FC4"/>
+    <w:multiLevelType w:val="hybridMultilevel"/>
+    <w:tmpl w:val="42622648"/>
+    <w:lvl w:ilvl="0" w:tplc="04090001">
+      <w:start w:val="1"/>
+      <w:numFmt w:val="bullet"/>
+      <w:lvlText w:val=""/>
+      <w:lvlJc w:val="left"/>
+      <w:pPr>
+        <w:ind w:left="1080" w:hanging="360"/>
+      </w:pPr>
+      <w:rPr>
+        <w:rFonts w:ascii="Symbol" w:hAnsi="Symbol" w:hint="default"/>
+      </w:rPr>
+    </w:lvl>
+    <w:lvl w:ilvl="1" w:tplc="04090003" w:tentative="1">
+      <w:start w:val="1"/>
+      <w:numFmt w:val="bullet"/>
+      <w:lvlText w:val="o"/>
+      <w:lvlJc w:val="left"/>
+      <w:pPr>
+        <w:ind w:left="1800" w:hanging="360"/>
+      </w:pPr>
+      <w:rPr>
+        <w:rFonts w:ascii="Courier New" w:hAnsi="Courier New" w:cs="Courier New" w:hint="default"/>
+      </w:rPr>
+    </w:lvl>
+    <w:lvl w:ilvl="2" w:tplc="04090005" w:tentative="1">
+      <w:start w:val="1"/>
+      <w:numFmt w:val="bullet"/>
+      <w:lvlText w:val=""/>
+      <w:lvlJc w:val="left"/>
+      <w:pPr>
+        <w:ind w:left="2520" w:hanging="360"/>
+      </w:pPr>
+      <w:rPr>
+        <w:rFonts w:ascii="Wingdings" w:hAnsi="Wingdings" w:hint="default"/>
+      </w:rPr>
+    </w:lvl>
+    <w:lvl w:ilvl="3" w:tplc="04090001" w:tentative="1">
+      <w:start w:val="1"/>
+      <w:numFmt w:val="bullet"/>
+      <w:lvlText w:val=""/>
+      <w:lvlJc w:val="left"/>
+      <w:pPr>
+        <w:ind w:left="3240" w:hanging="360"/>
+      </w:pPr>
+      <w:rPr>
+        <w:rFonts w:ascii="Symbol" w:hAnsi="Symbol" w:hint="default"/>
+      </w:rPr>
+    </w:lvl>
+    <w:lvl w:ilvl="4" w:tplc="04090003" w:tentative="1">
+      <w:start w:val="1"/>
+      <w:numFmt w:val="bullet"/>
+      <w:lvlText w:val="o"/>
+      <w:lvlJc w:val="left"/>
+      <w:pPr>
+        <w:ind w:left="3960" w:hanging="360"/>
+      </w:pPr>
+      <w:rPr>
+        <w:rFonts w:ascii="Courier New" w:hAnsi="Courier New" w:cs="Courier New" w:hint="default"/>
+      </w:rPr>
+    </w:lvl>
+    <w:lvl w:ilvl="5" w:tplc="04090005" w:tentative="1">
+      <w:start w:val="1"/>
+      <w:numFmt w:val="bullet"/>
+      <w:lvlText w:val=""/>
+      <w:lvlJc w:val="left"/>
+      <w:pPr>
+        <w:ind w:left="4680" w:hanging="360"/>
+      </w:pPr>
+      <w:rPr>
+        <w:rFonts w:ascii="Wingdings" w:hAnsi="Wingdings" w:hint="default"/>
+      </w:rPr>
+    </w:lvl>
+    <w:lvl w:ilvl="6" w:tplc="04090001" w:tentative="1">
+      <w:start w:val="1"/>
+      <w:numFmt w:val="bullet"/>
+      <w:lvlText w:val=""/>
+      <w:lvlJc w:val="left"/>
+      <w:pPr>
+        <w:ind w:left="5400" w:hanging="360"/>
+      </w:pPr>
+      <w:rPr>
+        <w:rFonts w:ascii="Symbol" w:hAnsi="Symbol" w:hint="default"/>
+      </w:rPr>
+    </w:lvl>
+    <w:lvl w:ilvl="7" w:tplc="04090003" w:tentative="1">
+      <w:start w:val="1"/>
+      <w:numFmt w:val="bullet"/>
+      <w:lvlText w:val="o"/>
+      <w:lvlJc w:val="left"/>
+      <w:pPr>
+        <w:ind w:left="6120" w:hanging="360"/>
+      </w:pPr>
+      <w:rPr>
+        <w:rFonts w:ascii="Courier New" w:hAnsi="Courier New" w:cs="Courier New" w:hint="default"/>
+      </w:rPr>
+    </w:lvl>
+    <w:lvl w:ilvl="8" w:tplc="04090005" w:tentative="1">
+      <w:start w:val="1"/>
+      <w:numFmt w:val="bullet"/>
+      <w:lvlText w:val=""/>
+      <w:lvlJc w:val="left"/>
+      <w:pPr>
+        <w:ind w:left="6840" w:hanging="360"/>
+      </w:pPr>
+      <w:rPr>
+        <w:rFonts w:ascii="Wingdings" w:hAnsi="Wingdings" w:hint="default"/>
+      </w:rPr>
+    </w:lvl>
+  </w:abstractNum>
+  <w:abstractNum w:abstractNumId="53" w15:restartNumberingAfterBreak="0">
     <w:nsid w:val="50C73082"/>
     <w:multiLevelType w:val="hybridMultilevel"/>
     <w:tmpl w:val="C58E57B0"/>
@@ -12770,7 +14837,7 @@
       </w:rPr>
     </w:lvl>
   </w:abstractNum>
-  <w:abstractNum w:abstractNumId="47" w15:restartNumberingAfterBreak="0">
+  <w:abstractNum w:abstractNumId="54" w15:restartNumberingAfterBreak="0">
     <w:nsid w:val="5153349C"/>
     <w:multiLevelType w:val="hybridMultilevel"/>
     <w:tmpl w:val="7A3A9A96"/>
@@ -12883,7 +14950,7 @@
       </w:rPr>
     </w:lvl>
   </w:abstractNum>
-  <w:abstractNum w:abstractNumId="48" w15:restartNumberingAfterBreak="0">
+  <w:abstractNum w:abstractNumId="55" w15:restartNumberingAfterBreak="0">
     <w:nsid w:val="51C233E9"/>
     <w:multiLevelType w:val="hybridMultilevel"/>
     <w:tmpl w:val="77B2554A"/>
@@ -12996,7 +15063,7 @@
       </w:rPr>
     </w:lvl>
   </w:abstractNum>
-  <w:abstractNum w:abstractNumId="49" w15:restartNumberingAfterBreak="0">
+  <w:abstractNum w:abstractNumId="56" w15:restartNumberingAfterBreak="0">
     <w:nsid w:val="55364ED4"/>
     <w:multiLevelType w:val="hybridMultilevel"/>
     <w:tmpl w:val="FD0EB49E"/>
@@ -13109,7 +15176,7 @@
       </w:rPr>
     </w:lvl>
   </w:abstractNum>
-  <w:abstractNum w:abstractNumId="50" w15:restartNumberingAfterBreak="0">
+  <w:abstractNum w:abstractNumId="57" w15:restartNumberingAfterBreak="0">
     <w:nsid w:val="56CE5FA7"/>
     <w:multiLevelType w:val="hybridMultilevel"/>
     <w:tmpl w:val="A878971C"/>
@@ -13222,7 +15289,7 @@
       </w:rPr>
     </w:lvl>
   </w:abstractNum>
-  <w:abstractNum w:abstractNumId="51" w15:restartNumberingAfterBreak="0">
+  <w:abstractNum w:abstractNumId="58" w15:restartNumberingAfterBreak="0">
     <w:nsid w:val="57192222"/>
     <w:multiLevelType w:val="hybridMultilevel"/>
     <w:tmpl w:val="F1A01CE2"/>
@@ -13335,7 +15402,7 @@
       </w:rPr>
     </w:lvl>
   </w:abstractNum>
-  <w:abstractNum w:abstractNumId="52" w15:restartNumberingAfterBreak="0">
+  <w:abstractNum w:abstractNumId="59" w15:restartNumberingAfterBreak="0">
     <w:nsid w:val="57FD3E08"/>
     <w:multiLevelType w:val="hybridMultilevel"/>
     <w:tmpl w:val="D63E8686"/>
@@ -13448,7 +15515,7 @@
       </w:rPr>
     </w:lvl>
   </w:abstractNum>
-  <w:abstractNum w:abstractNumId="53" w15:restartNumberingAfterBreak="0">
+  <w:abstractNum w:abstractNumId="60" w15:restartNumberingAfterBreak="0">
     <w:nsid w:val="58882196"/>
     <w:multiLevelType w:val="hybridMultilevel"/>
     <w:tmpl w:val="5EBE3650"/>
@@ -13561,7 +15628,7 @@
       </w:rPr>
     </w:lvl>
   </w:abstractNum>
-  <w:abstractNum w:abstractNumId="54" w15:restartNumberingAfterBreak="0">
+  <w:abstractNum w:abstractNumId="61" w15:restartNumberingAfterBreak="0">
     <w:nsid w:val="58945EB3"/>
     <w:multiLevelType w:val="hybridMultilevel"/>
     <w:tmpl w:val="68261456"/>
@@ -13674,7 +15741,7 @@
       </w:rPr>
     </w:lvl>
   </w:abstractNum>
-  <w:abstractNum w:abstractNumId="55" w15:restartNumberingAfterBreak="0">
+  <w:abstractNum w:abstractNumId="62" w15:restartNumberingAfterBreak="0">
     <w:nsid w:val="593C2B88"/>
     <w:multiLevelType w:val="hybridMultilevel"/>
     <w:tmpl w:val="9E582E1A"/>
@@ -13787,7 +15854,7 @@
       </w:rPr>
     </w:lvl>
   </w:abstractNum>
-  <w:abstractNum w:abstractNumId="56" w15:restartNumberingAfterBreak="0">
+  <w:abstractNum w:abstractNumId="63" w15:restartNumberingAfterBreak="0">
     <w:nsid w:val="5A3D1978"/>
     <w:multiLevelType w:val="hybridMultilevel"/>
     <w:tmpl w:val="71CE5944"/>
@@ -13900,7 +15967,7 @@
       </w:rPr>
     </w:lvl>
   </w:abstractNum>
-  <w:abstractNum w:abstractNumId="57" w15:restartNumberingAfterBreak="0">
+  <w:abstractNum w:abstractNumId="64" w15:restartNumberingAfterBreak="0">
     <w:nsid w:val="5B482F9C"/>
     <w:multiLevelType w:val="hybridMultilevel"/>
     <w:tmpl w:val="C9D69410"/>
@@ -14013,7 +16080,7 @@
       </w:rPr>
     </w:lvl>
   </w:abstractNum>
-  <w:abstractNum w:abstractNumId="58" w15:restartNumberingAfterBreak="0">
+  <w:abstractNum w:abstractNumId="65" w15:restartNumberingAfterBreak="0">
     <w:nsid w:val="5BB74554"/>
     <w:multiLevelType w:val="hybridMultilevel"/>
     <w:tmpl w:val="E78A4068"/>
@@ -14126,7 +16193,7 @@
       </w:rPr>
     </w:lvl>
   </w:abstractNum>
-  <w:abstractNum w:abstractNumId="59" w15:restartNumberingAfterBreak="0">
+  <w:abstractNum w:abstractNumId="66" w15:restartNumberingAfterBreak="0">
     <w:nsid w:val="5C835ABD"/>
     <w:multiLevelType w:val="hybridMultilevel"/>
     <w:tmpl w:val="A258796C"/>
@@ -14239,7 +16306,120 @@
       </w:rPr>
     </w:lvl>
   </w:abstractNum>
-  <w:abstractNum w:abstractNumId="60" w15:restartNumberingAfterBreak="0">
+  <w:abstractNum w:abstractNumId="67" w15:restartNumberingAfterBreak="0">
+    <w:nsid w:val="5D606528"/>
+    <w:multiLevelType w:val="hybridMultilevel"/>
+    <w:tmpl w:val="A6965EDE"/>
+    <w:lvl w:ilvl="0" w:tplc="04090001">
+      <w:start w:val="1"/>
+      <w:numFmt w:val="bullet"/>
+      <w:lvlText w:val=""/>
+      <w:lvlJc w:val="left"/>
+      <w:pPr>
+        <w:ind w:left="720" w:hanging="360"/>
+      </w:pPr>
+      <w:rPr>
+        <w:rFonts w:ascii="Symbol" w:hAnsi="Symbol" w:hint="default"/>
+      </w:rPr>
+    </w:lvl>
+    <w:lvl w:ilvl="1" w:tplc="04090003" w:tentative="1">
+      <w:start w:val="1"/>
+      <w:numFmt w:val="bullet"/>
+      <w:lvlText w:val="o"/>
+      <w:lvlJc w:val="left"/>
+      <w:pPr>
+        <w:ind w:left="1440" w:hanging="360"/>
+      </w:pPr>
+      <w:rPr>
+        <w:rFonts w:ascii="Courier New" w:hAnsi="Courier New" w:cs="Courier New" w:hint="default"/>
+      </w:rPr>
+    </w:lvl>
+    <w:lvl w:ilvl="2" w:tplc="04090005" w:tentative="1">
+      <w:start w:val="1"/>
+      <w:numFmt w:val="bullet"/>
+      <w:lvlText w:val=""/>
+      <w:lvlJc w:val="left"/>
+      <w:pPr>
+        <w:ind w:left="2160" w:hanging="360"/>
+      </w:pPr>
+      <w:rPr>
+        <w:rFonts w:ascii="Wingdings" w:hAnsi="Wingdings" w:hint="default"/>
+      </w:rPr>
+    </w:lvl>
+    <w:lvl w:ilvl="3" w:tplc="04090001" w:tentative="1">
+      <w:start w:val="1"/>
+      <w:numFmt w:val="bullet"/>
+      <w:lvlText w:val=""/>
+      <w:lvlJc w:val="left"/>
+      <w:pPr>
+        <w:ind w:left="2880" w:hanging="360"/>
+      </w:pPr>
+      <w:rPr>
+        <w:rFonts w:ascii="Symbol" w:hAnsi="Symbol" w:hint="default"/>
+      </w:rPr>
+    </w:lvl>
+    <w:lvl w:ilvl="4" w:tplc="04090003" w:tentative="1">
+      <w:start w:val="1"/>
+      <w:numFmt w:val="bullet"/>
+      <w:lvlText w:val="o"/>
+      <w:lvlJc w:val="left"/>
+      <w:pPr>
+        <w:ind w:left="3600" w:hanging="360"/>
+      </w:pPr>
+      <w:rPr>
+        <w:rFonts w:ascii="Courier New" w:hAnsi="Courier New" w:cs="Courier New" w:hint="default"/>
+      </w:rPr>
+    </w:lvl>
+    <w:lvl w:ilvl="5" w:tplc="04090005" w:tentative="1">
+      <w:start w:val="1"/>
+      <w:numFmt w:val="bullet"/>
+      <w:lvlText w:val=""/>
+      <w:lvlJc w:val="left"/>
+      <w:pPr>
+        <w:ind w:left="4320" w:hanging="360"/>
+      </w:pPr>
+      <w:rPr>
+        <w:rFonts w:ascii="Wingdings" w:hAnsi="Wingdings" w:hint="default"/>
+      </w:rPr>
+    </w:lvl>
+    <w:lvl w:ilvl="6" w:tplc="04090001" w:tentative="1">
+      <w:start w:val="1"/>
+      <w:numFmt w:val="bullet"/>
+      <w:lvlText w:val=""/>
+      <w:lvlJc w:val="left"/>
+      <w:pPr>
+        <w:ind w:left="5040" w:hanging="360"/>
+      </w:pPr>
+      <w:rPr>
+        <w:rFonts w:ascii="Symbol" w:hAnsi="Symbol" w:hint="default"/>
+      </w:rPr>
+    </w:lvl>
+    <w:lvl w:ilvl="7" w:tplc="04090003" w:tentative="1">
+      <w:start w:val="1"/>
+      <w:numFmt w:val="bullet"/>
+      <w:lvlText w:val="o"/>
+      <w:lvlJc w:val="left"/>
+      <w:pPr>
+        <w:ind w:left="5760" w:hanging="360"/>
+      </w:pPr>
+      <w:rPr>
+        <w:rFonts w:ascii="Courier New" w:hAnsi="Courier New" w:cs="Courier New" w:hint="default"/>
+      </w:rPr>
+    </w:lvl>
+    <w:lvl w:ilvl="8" w:tplc="04090005" w:tentative="1">
+      <w:start w:val="1"/>
+      <w:numFmt w:val="bullet"/>
+      <w:lvlText w:val=""/>
+      <w:lvlJc w:val="left"/>
+      <w:pPr>
+        <w:ind w:left="6480" w:hanging="360"/>
+      </w:pPr>
+      <w:rPr>
+        <w:rFonts w:ascii="Wingdings" w:hAnsi="Wingdings" w:hint="default"/>
+      </w:rPr>
+    </w:lvl>
+  </w:abstractNum>
+  <w:abstractNum w:abstractNumId="68" w15:restartNumberingAfterBreak="0">
     <w:nsid w:val="602B11C8"/>
     <w:multiLevelType w:val="hybridMultilevel"/>
     <w:tmpl w:val="9BA48752"/>
@@ -14352,7 +16532,7 @@
       </w:rPr>
     </w:lvl>
   </w:abstractNum>
-  <w:abstractNum w:abstractNumId="61" w15:restartNumberingAfterBreak="0">
+  <w:abstractNum w:abstractNumId="69" w15:restartNumberingAfterBreak="0">
     <w:nsid w:val="61BA7597"/>
     <w:multiLevelType w:val="hybridMultilevel"/>
     <w:tmpl w:val="290AC428"/>
@@ -14465,7 +16645,7 @@
       </w:rPr>
     </w:lvl>
   </w:abstractNum>
-  <w:abstractNum w:abstractNumId="62" w15:restartNumberingAfterBreak="0">
+  <w:abstractNum w:abstractNumId="70" w15:restartNumberingAfterBreak="0">
     <w:nsid w:val="63A86231"/>
     <w:multiLevelType w:val="hybridMultilevel"/>
     <w:tmpl w:val="FD8C8C94"/>
@@ -14578,7 +16758,7 @@
       </w:rPr>
     </w:lvl>
   </w:abstractNum>
-  <w:abstractNum w:abstractNumId="63" w15:restartNumberingAfterBreak="0">
+  <w:abstractNum w:abstractNumId="71" w15:restartNumberingAfterBreak="0">
     <w:nsid w:val="65E42C28"/>
     <w:multiLevelType w:val="hybridMultilevel"/>
     <w:tmpl w:val="76E4A35C"/>
@@ -14691,7 +16871,7 @@
       </w:rPr>
     </w:lvl>
   </w:abstractNum>
-  <w:abstractNum w:abstractNumId="64" w15:restartNumberingAfterBreak="0">
+  <w:abstractNum w:abstractNumId="72" w15:restartNumberingAfterBreak="0">
     <w:nsid w:val="685260C1"/>
     <w:multiLevelType w:val="hybridMultilevel"/>
     <w:tmpl w:val="1486CC9C"/>
@@ -14804,7 +16984,7 @@
       </w:rPr>
     </w:lvl>
   </w:abstractNum>
-  <w:abstractNum w:abstractNumId="65" w15:restartNumberingAfterBreak="0">
+  <w:abstractNum w:abstractNumId="73" w15:restartNumberingAfterBreak="0">
     <w:nsid w:val="68BD763D"/>
     <w:multiLevelType w:val="hybridMultilevel"/>
     <w:tmpl w:val="8AD809F6"/>
@@ -14917,7 +17097,7 @@
       </w:rPr>
     </w:lvl>
   </w:abstractNum>
-  <w:abstractNum w:abstractNumId="66" w15:restartNumberingAfterBreak="0">
+  <w:abstractNum w:abstractNumId="74" w15:restartNumberingAfterBreak="0">
     <w:nsid w:val="696522F0"/>
     <w:multiLevelType w:val="hybridMultilevel"/>
     <w:tmpl w:val="BF5E066E"/>
@@ -15030,7 +17210,7 @@
       </w:rPr>
     </w:lvl>
   </w:abstractNum>
-  <w:abstractNum w:abstractNumId="67" w15:restartNumberingAfterBreak="0">
+  <w:abstractNum w:abstractNumId="75" w15:restartNumberingAfterBreak="0">
     <w:nsid w:val="6A8539E6"/>
     <w:multiLevelType w:val="hybridMultilevel"/>
     <w:tmpl w:val="CC6CEAFA"/>
@@ -15143,7 +17323,7 @@
       </w:rPr>
     </w:lvl>
   </w:abstractNum>
-  <w:abstractNum w:abstractNumId="68" w15:restartNumberingAfterBreak="0">
+  <w:abstractNum w:abstractNumId="76" w15:restartNumberingAfterBreak="0">
     <w:nsid w:val="6B097CDC"/>
     <w:multiLevelType w:val="hybridMultilevel"/>
     <w:tmpl w:val="A022B50A"/>
@@ -15256,7 +17436,7 @@
       </w:rPr>
     </w:lvl>
   </w:abstractNum>
-  <w:abstractNum w:abstractNumId="69" w15:restartNumberingAfterBreak="0">
+  <w:abstractNum w:abstractNumId="77" w15:restartNumberingAfterBreak="0">
     <w:nsid w:val="6E2672C3"/>
     <w:multiLevelType w:val="hybridMultilevel"/>
     <w:tmpl w:val="1DAE1292"/>
@@ -15369,7 +17549,7 @@
       </w:rPr>
     </w:lvl>
   </w:abstractNum>
-  <w:abstractNum w:abstractNumId="70" w15:restartNumberingAfterBreak="0">
+  <w:abstractNum w:abstractNumId="78" w15:restartNumberingAfterBreak="0">
     <w:nsid w:val="6E807D12"/>
     <w:multiLevelType w:val="hybridMultilevel"/>
     <w:tmpl w:val="B72C92A8"/>
@@ -15482,7 +17662,7 @@
       </w:rPr>
     </w:lvl>
   </w:abstractNum>
-  <w:abstractNum w:abstractNumId="71" w15:restartNumberingAfterBreak="0">
+  <w:abstractNum w:abstractNumId="79" w15:restartNumberingAfterBreak="0">
     <w:nsid w:val="6FF560C2"/>
     <w:multiLevelType w:val="hybridMultilevel"/>
     <w:tmpl w:val="91F4D976"/>
@@ -15595,7 +17775,7 @@
       </w:rPr>
     </w:lvl>
   </w:abstractNum>
-  <w:abstractNum w:abstractNumId="72" w15:restartNumberingAfterBreak="0">
+  <w:abstractNum w:abstractNumId="80" w15:restartNumberingAfterBreak="0">
     <w:nsid w:val="70123115"/>
     <w:multiLevelType w:val="hybridMultilevel"/>
     <w:tmpl w:val="39BC5956"/>
@@ -15708,7 +17888,7 @@
       </w:rPr>
     </w:lvl>
   </w:abstractNum>
-  <w:abstractNum w:abstractNumId="73" w15:restartNumberingAfterBreak="0">
+  <w:abstractNum w:abstractNumId="81" w15:restartNumberingAfterBreak="0">
     <w:nsid w:val="712B4291"/>
     <w:multiLevelType w:val="hybridMultilevel"/>
     <w:tmpl w:val="CDA60C5E"/>
@@ -15821,7 +18001,7 @@
       </w:rPr>
     </w:lvl>
   </w:abstractNum>
-  <w:abstractNum w:abstractNumId="74" w15:restartNumberingAfterBreak="0">
+  <w:abstractNum w:abstractNumId="82" w15:restartNumberingAfterBreak="0">
     <w:nsid w:val="717E4302"/>
     <w:multiLevelType w:val="hybridMultilevel"/>
     <w:tmpl w:val="B5EA7B2A"/>
@@ -15934,7 +18114,7 @@
       </w:rPr>
     </w:lvl>
   </w:abstractNum>
-  <w:abstractNum w:abstractNumId="75" w15:restartNumberingAfterBreak="0">
+  <w:abstractNum w:abstractNumId="83" w15:restartNumberingAfterBreak="0">
     <w:nsid w:val="759D4D09"/>
     <w:multiLevelType w:val="hybridMultilevel"/>
     <w:tmpl w:val="19B80018"/>
@@ -16047,7 +18227,7 @@
       </w:rPr>
     </w:lvl>
   </w:abstractNum>
-  <w:abstractNum w:abstractNumId="76" w15:restartNumberingAfterBreak="0">
+  <w:abstractNum w:abstractNumId="84" w15:restartNumberingAfterBreak="0">
     <w:nsid w:val="772B7468"/>
     <w:multiLevelType w:val="hybridMultilevel"/>
     <w:tmpl w:val="F8A67A32"/>
@@ -16160,7 +18340,120 @@
       </w:rPr>
     </w:lvl>
   </w:abstractNum>
-  <w:abstractNum w:abstractNumId="77" w15:restartNumberingAfterBreak="0">
+  <w:abstractNum w:abstractNumId="85" w15:restartNumberingAfterBreak="0">
+    <w:nsid w:val="77A95878"/>
+    <w:multiLevelType w:val="hybridMultilevel"/>
+    <w:tmpl w:val="66485FF0"/>
+    <w:lvl w:ilvl="0" w:tplc="04090001">
+      <w:start w:val="1"/>
+      <w:numFmt w:val="bullet"/>
+      <w:lvlText w:val=""/>
+      <w:lvlJc w:val="left"/>
+      <w:pPr>
+        <w:ind w:left="720" w:hanging="360"/>
+      </w:pPr>
+      <w:rPr>
+        <w:rFonts w:ascii="Symbol" w:hAnsi="Symbol" w:hint="default"/>
+      </w:rPr>
+    </w:lvl>
+    <w:lvl w:ilvl="1" w:tplc="04090003" w:tentative="1">
+      <w:start w:val="1"/>
+      <w:numFmt w:val="bullet"/>
+      <w:lvlText w:val="o"/>
+      <w:lvlJc w:val="left"/>
+      <w:pPr>
+        <w:ind w:left="1440" w:hanging="360"/>
+      </w:pPr>
+      <w:rPr>
+        <w:rFonts w:ascii="Courier New" w:hAnsi="Courier New" w:cs="Courier New" w:hint="default"/>
+      </w:rPr>
+    </w:lvl>
+    <w:lvl w:ilvl="2" w:tplc="04090005" w:tentative="1">
+      <w:start w:val="1"/>
+      <w:numFmt w:val="bullet"/>
+      <w:lvlText w:val=""/>
+      <w:lvlJc w:val="left"/>
+      <w:pPr>
+        <w:ind w:left="2160" w:hanging="360"/>
+      </w:pPr>
+      <w:rPr>
+        <w:rFonts w:ascii="Wingdings" w:hAnsi="Wingdings" w:hint="default"/>
+      </w:rPr>
+    </w:lvl>
+    <w:lvl w:ilvl="3" w:tplc="04090001" w:tentative="1">
+      <w:start w:val="1"/>
+      <w:numFmt w:val="bullet"/>
+      <w:lvlText w:val=""/>
+      <w:lvlJc w:val="left"/>
+      <w:pPr>
+        <w:ind w:left="2880" w:hanging="360"/>
+      </w:pPr>
+      <w:rPr>
+        <w:rFonts w:ascii="Symbol" w:hAnsi="Symbol" w:hint="default"/>
+      </w:rPr>
+    </w:lvl>
+    <w:lvl w:ilvl="4" w:tplc="04090003" w:tentative="1">
+      <w:start w:val="1"/>
+      <w:numFmt w:val="bullet"/>
+      <w:lvlText w:val="o"/>
+      <w:lvlJc w:val="left"/>
+      <w:pPr>
+        <w:ind w:left="3600" w:hanging="360"/>
+      </w:pPr>
+      <w:rPr>
+        <w:rFonts w:ascii="Courier New" w:hAnsi="Courier New" w:cs="Courier New" w:hint="default"/>
+      </w:rPr>
+    </w:lvl>
+    <w:lvl w:ilvl="5" w:tplc="04090005" w:tentative="1">
+      <w:start w:val="1"/>
+      <w:numFmt w:val="bullet"/>
+      <w:lvlText w:val=""/>
+      <w:lvlJc w:val="left"/>
+      <w:pPr>
+        <w:ind w:left="4320" w:hanging="360"/>
+      </w:pPr>
+      <w:rPr>
+        <w:rFonts w:ascii="Wingdings" w:hAnsi="Wingdings" w:hint="default"/>
+      </w:rPr>
+    </w:lvl>
+    <w:lvl w:ilvl="6" w:tplc="04090001" w:tentative="1">
+      <w:start w:val="1"/>
+      <w:numFmt w:val="bullet"/>
+      <w:lvlText w:val=""/>
+      <w:lvlJc w:val="left"/>
+      <w:pPr>
+        <w:ind w:left="5040" w:hanging="360"/>
+      </w:pPr>
+      <w:rPr>
+        <w:rFonts w:ascii="Symbol" w:hAnsi="Symbol" w:hint="default"/>
+      </w:rPr>
+    </w:lvl>
+    <w:lvl w:ilvl="7" w:tplc="04090003" w:tentative="1">
+      <w:start w:val="1"/>
+      <w:numFmt w:val="bullet"/>
+      <w:lvlText w:val="o"/>
+      <w:lvlJc w:val="left"/>
+      <w:pPr>
+        <w:ind w:left="5760" w:hanging="360"/>
+      </w:pPr>
+      <w:rPr>
+        <w:rFonts w:ascii="Courier New" w:hAnsi="Courier New" w:cs="Courier New" w:hint="default"/>
+      </w:rPr>
+    </w:lvl>
+    <w:lvl w:ilvl="8" w:tplc="04090005" w:tentative="1">
+      <w:start w:val="1"/>
+      <w:numFmt w:val="bullet"/>
+      <w:lvlText w:val=""/>
+      <w:lvlJc w:val="left"/>
+      <w:pPr>
+        <w:ind w:left="6480" w:hanging="360"/>
+      </w:pPr>
+      <w:rPr>
+        <w:rFonts w:ascii="Wingdings" w:hAnsi="Wingdings" w:hint="default"/>
+      </w:rPr>
+    </w:lvl>
+  </w:abstractNum>
+  <w:abstractNum w:abstractNumId="86" w15:restartNumberingAfterBreak="0">
     <w:nsid w:val="78B51AFB"/>
     <w:multiLevelType w:val="hybridMultilevel"/>
     <w:tmpl w:val="82AA56E0"/>
@@ -16273,7 +18566,7 @@
       </w:rPr>
     </w:lvl>
   </w:abstractNum>
-  <w:abstractNum w:abstractNumId="78" w15:restartNumberingAfterBreak="0">
+  <w:abstractNum w:abstractNumId="87" w15:restartNumberingAfterBreak="0">
     <w:nsid w:val="7A845F70"/>
     <w:multiLevelType w:val="hybridMultilevel"/>
     <w:tmpl w:val="3A52D90A"/>
@@ -16386,7 +18679,7 @@
       </w:rPr>
     </w:lvl>
   </w:abstractNum>
-  <w:abstractNum w:abstractNumId="79" w15:restartNumberingAfterBreak="0">
+  <w:abstractNum w:abstractNumId="88" w15:restartNumberingAfterBreak="0">
     <w:nsid w:val="7CF75E7A"/>
     <w:multiLevelType w:val="hybridMultilevel"/>
     <w:tmpl w:val="34701A02"/>
@@ -16499,7 +18792,7 @@
       </w:rPr>
     </w:lvl>
   </w:abstractNum>
-  <w:abstractNum w:abstractNumId="80" w15:restartNumberingAfterBreak="0">
+  <w:abstractNum w:abstractNumId="89" w15:restartNumberingAfterBreak="0">
     <w:nsid w:val="7DA443EB"/>
     <w:multiLevelType w:val="hybridMultilevel"/>
     <w:tmpl w:val="C416F7C2"/>
@@ -16612,7 +18905,7 @@
       </w:rPr>
     </w:lvl>
   </w:abstractNum>
-  <w:abstractNum w:abstractNumId="81" w15:restartNumberingAfterBreak="0">
+  <w:abstractNum w:abstractNumId="90" w15:restartNumberingAfterBreak="0">
     <w:nsid w:val="7ED61C38"/>
     <w:multiLevelType w:val="hybridMultilevel"/>
     <w:tmpl w:val="69F0958C"/>
@@ -16725,7 +19018,7 @@
       </w:rPr>
     </w:lvl>
   </w:abstractNum>
-  <w:abstractNum w:abstractNumId="82" w15:restartNumberingAfterBreak="0">
+  <w:abstractNum w:abstractNumId="91" w15:restartNumberingAfterBreak="0">
     <w:nsid w:val="7FB224A2"/>
     <w:multiLevelType w:val="hybridMultilevel"/>
     <w:tmpl w:val="29DAFC04"/>
@@ -16839,253 +19132,280 @@
     </w:lvl>
   </w:abstractNum>
   <w:num w:numId="1" w16cid:durableId="24671682">
+    <w:abstractNumId w:val="50"/>
+  </w:num>
+  <w:num w:numId="2" w16cid:durableId="2104522685">
+    <w:abstractNumId w:val="64"/>
+  </w:num>
+  <w:num w:numId="3" w16cid:durableId="86924267">
+    <w:abstractNumId w:val="89"/>
+  </w:num>
+  <w:num w:numId="4" w16cid:durableId="590435838">
+    <w:abstractNumId w:val="3"/>
+  </w:num>
+  <w:num w:numId="5" w16cid:durableId="1739205017">
+    <w:abstractNumId w:val="55"/>
+  </w:num>
+  <w:num w:numId="6" w16cid:durableId="1782334488">
+    <w:abstractNumId w:val="37"/>
+  </w:num>
+  <w:num w:numId="7" w16cid:durableId="341400879">
+    <w:abstractNumId w:val="7"/>
+  </w:num>
+  <w:num w:numId="8" w16cid:durableId="724452935">
+    <w:abstractNumId w:val="57"/>
+  </w:num>
+  <w:num w:numId="9" w16cid:durableId="1847789390">
+    <w:abstractNumId w:val="51"/>
+  </w:num>
+  <w:num w:numId="10" w16cid:durableId="1805927856">
+    <w:abstractNumId w:val="8"/>
+  </w:num>
+  <w:num w:numId="11" w16cid:durableId="82998063">
+    <w:abstractNumId w:val="65"/>
+  </w:num>
+  <w:num w:numId="12" w16cid:durableId="1191604945">
+    <w:abstractNumId w:val="47"/>
+  </w:num>
+  <w:num w:numId="13" w16cid:durableId="852837458">
+    <w:abstractNumId w:val="71"/>
+  </w:num>
+  <w:num w:numId="14" w16cid:durableId="69426069">
+    <w:abstractNumId w:val="80"/>
+  </w:num>
+  <w:num w:numId="15" w16cid:durableId="418212339">
+    <w:abstractNumId w:val="25"/>
+  </w:num>
+  <w:num w:numId="16" w16cid:durableId="2012368573">
+    <w:abstractNumId w:val="6"/>
+  </w:num>
+  <w:num w:numId="17" w16cid:durableId="849685296">
+    <w:abstractNumId w:val="79"/>
+  </w:num>
+  <w:num w:numId="18" w16cid:durableId="1293973808">
+    <w:abstractNumId w:val="36"/>
+  </w:num>
+  <w:num w:numId="19" w16cid:durableId="1112093579">
+    <w:abstractNumId w:val="42"/>
+  </w:num>
+  <w:num w:numId="20" w16cid:durableId="725221431">
+    <w:abstractNumId w:val="15"/>
+  </w:num>
+  <w:num w:numId="21" w16cid:durableId="519051001">
+    <w:abstractNumId w:val="18"/>
+  </w:num>
+  <w:num w:numId="22" w16cid:durableId="351734411">
+    <w:abstractNumId w:val="1"/>
+  </w:num>
+  <w:num w:numId="23" w16cid:durableId="1659576760">
+    <w:abstractNumId w:val="46"/>
+  </w:num>
+  <w:num w:numId="24" w16cid:durableId="995648169">
+    <w:abstractNumId w:val="16"/>
+  </w:num>
+  <w:num w:numId="25" w16cid:durableId="2125273593">
+    <w:abstractNumId w:val="83"/>
+  </w:num>
+  <w:num w:numId="26" w16cid:durableId="1192763523">
+    <w:abstractNumId w:val="48"/>
+  </w:num>
+  <w:num w:numId="27" w16cid:durableId="419303702">
+    <w:abstractNumId w:val="78"/>
+  </w:num>
+  <w:num w:numId="28" w16cid:durableId="1737972737">
+    <w:abstractNumId w:val="31"/>
+  </w:num>
+  <w:num w:numId="29" w16cid:durableId="405029989">
+    <w:abstractNumId w:val="32"/>
+  </w:num>
+  <w:num w:numId="30" w16cid:durableId="1056709340">
+    <w:abstractNumId w:val="28"/>
+  </w:num>
+  <w:num w:numId="31" w16cid:durableId="619343773">
+    <w:abstractNumId w:val="73"/>
+  </w:num>
+  <w:num w:numId="32" w16cid:durableId="1593465196">
+    <w:abstractNumId w:val="13"/>
+  </w:num>
+  <w:num w:numId="33" w16cid:durableId="808782727">
+    <w:abstractNumId w:val="45"/>
+  </w:num>
+  <w:num w:numId="34" w16cid:durableId="1237976542">
+    <w:abstractNumId w:val="66"/>
+  </w:num>
+  <w:num w:numId="35" w16cid:durableId="1007363703">
     <w:abstractNumId w:val="44"/>
   </w:num>
-  <w:num w:numId="2" w16cid:durableId="2104522685">
-    <w:abstractNumId w:val="57"/>
+  <w:num w:numId="36" w16cid:durableId="628047081">
+    <w:abstractNumId w:val="59"/>
   </w:num>
-  <w:num w:numId="3" w16cid:durableId="86924267">
-    <w:abstractNumId w:val="80"/>
+  <w:num w:numId="37" w16cid:durableId="275867737">
+    <w:abstractNumId w:val="49"/>
   </w:num>
-  <w:num w:numId="4" w16cid:durableId="590435838">
+  <w:num w:numId="38" w16cid:durableId="762920877">
+    <w:abstractNumId w:val="19"/>
+  </w:num>
+  <w:num w:numId="39" w16cid:durableId="127748478">
+    <w:abstractNumId w:val="22"/>
+  </w:num>
+  <w:num w:numId="40" w16cid:durableId="1381586733">
+    <w:abstractNumId w:val="24"/>
+  </w:num>
+  <w:num w:numId="41" w16cid:durableId="1652056397">
+    <w:abstractNumId w:val="4"/>
+  </w:num>
+  <w:num w:numId="42" w16cid:durableId="48379714">
+    <w:abstractNumId w:val="26"/>
+  </w:num>
+  <w:num w:numId="43" w16cid:durableId="1266882554">
+    <w:abstractNumId w:val="10"/>
+  </w:num>
+  <w:num w:numId="44" w16cid:durableId="14962304">
+    <w:abstractNumId w:val="68"/>
+  </w:num>
+  <w:num w:numId="45" w16cid:durableId="675765725">
+    <w:abstractNumId w:val="20"/>
+  </w:num>
+  <w:num w:numId="46" w16cid:durableId="1737127939">
+    <w:abstractNumId w:val="61"/>
+  </w:num>
+  <w:num w:numId="47" w16cid:durableId="1865363348">
+    <w:abstractNumId w:val="72"/>
+  </w:num>
+  <w:num w:numId="48" w16cid:durableId="1321884510">
+    <w:abstractNumId w:val="14"/>
+  </w:num>
+  <w:num w:numId="49" w16cid:durableId="433749920">
+    <w:abstractNumId w:val="87"/>
+  </w:num>
+  <w:num w:numId="50" w16cid:durableId="2050912484">
+    <w:abstractNumId w:val="75"/>
+  </w:num>
+  <w:num w:numId="51" w16cid:durableId="328599735">
     <w:abstractNumId w:val="2"/>
   </w:num>
-  <w:num w:numId="5" w16cid:durableId="1739205017">
-    <w:abstractNumId w:val="48"/>
+  <w:num w:numId="52" w16cid:durableId="516315795">
+    <w:abstractNumId w:val="88"/>
   </w:num>
-  <w:num w:numId="6" w16cid:durableId="1782334488">
+  <w:num w:numId="53" w16cid:durableId="720634748">
+    <w:abstractNumId w:val="54"/>
+  </w:num>
+  <w:num w:numId="54" w16cid:durableId="916137058">
+    <w:abstractNumId w:val="91"/>
+  </w:num>
+  <w:num w:numId="55" w16cid:durableId="1956209529">
+    <w:abstractNumId w:val="77"/>
+  </w:num>
+  <w:num w:numId="56" w16cid:durableId="383022568">
+    <w:abstractNumId w:val="23"/>
+  </w:num>
+  <w:num w:numId="57" w16cid:durableId="92481767">
+    <w:abstractNumId w:val="63"/>
+  </w:num>
+  <w:num w:numId="58" w16cid:durableId="1325930890">
+    <w:abstractNumId w:val="5"/>
+  </w:num>
+  <w:num w:numId="59" w16cid:durableId="962343949">
+    <w:abstractNumId w:val="12"/>
+  </w:num>
+  <w:num w:numId="60" w16cid:durableId="939338339">
+    <w:abstractNumId w:val="62"/>
+  </w:num>
+  <w:num w:numId="61" w16cid:durableId="64226443">
+    <w:abstractNumId w:val="81"/>
+  </w:num>
+  <w:num w:numId="62" w16cid:durableId="1156844156">
+    <w:abstractNumId w:val="84"/>
+  </w:num>
+  <w:num w:numId="63" w16cid:durableId="747772550">
+    <w:abstractNumId w:val="27"/>
+  </w:num>
+  <w:num w:numId="64" w16cid:durableId="412699077">
+    <w:abstractNumId w:val="39"/>
+  </w:num>
+  <w:num w:numId="65" w16cid:durableId="886720265">
+    <w:abstractNumId w:val="56"/>
+  </w:num>
+  <w:num w:numId="66" w16cid:durableId="1185943042">
+    <w:abstractNumId w:val="9"/>
+  </w:num>
+  <w:num w:numId="67" w16cid:durableId="802580017">
     <w:abstractNumId w:val="34"/>
   </w:num>
-  <w:num w:numId="7" w16cid:durableId="341400879">
-    <w:abstractNumId w:val="6"/>
+  <w:num w:numId="68" w16cid:durableId="1719665321">
+    <w:abstractNumId w:val="43"/>
   </w:num>
-  <w:num w:numId="8" w16cid:durableId="724452935">
-    <w:abstractNumId w:val="50"/>
+  <w:num w:numId="69" w16cid:durableId="154415603">
+    <w:abstractNumId w:val="86"/>
   </w:num>
-  <w:num w:numId="9" w16cid:durableId="1847789390">
-    <w:abstractNumId w:val="45"/>
+  <w:num w:numId="70" w16cid:durableId="855269244">
+    <w:abstractNumId w:val="69"/>
   </w:num>
-  <w:num w:numId="10" w16cid:durableId="1805927856">
-    <w:abstractNumId w:val="7"/>
+  <w:num w:numId="71" w16cid:durableId="2105564516">
+    <w:abstractNumId w:val="11"/>
   </w:num>
-  <w:num w:numId="11" w16cid:durableId="82998063">
+  <w:num w:numId="72" w16cid:durableId="21982529">
+    <w:abstractNumId w:val="17"/>
+  </w:num>
+  <w:num w:numId="73" w16cid:durableId="751197906">
+    <w:abstractNumId w:val="70"/>
+  </w:num>
+  <w:num w:numId="74" w16cid:durableId="1151600853">
+    <w:abstractNumId w:val="82"/>
+  </w:num>
+  <w:num w:numId="75" w16cid:durableId="194008492">
+    <w:abstractNumId w:val="74"/>
+  </w:num>
+  <w:num w:numId="76" w16cid:durableId="1476331496">
+    <w:abstractNumId w:val="90"/>
+  </w:num>
+  <w:num w:numId="77" w16cid:durableId="1933854576">
     <w:abstractNumId w:val="58"/>
   </w:num>
-  <w:num w:numId="12" w16cid:durableId="1191604945">
+  <w:num w:numId="78" w16cid:durableId="2113940026">
+    <w:abstractNumId w:val="29"/>
+  </w:num>
+  <w:num w:numId="79" w16cid:durableId="860700698">
+    <w:abstractNumId w:val="76"/>
+  </w:num>
+  <w:num w:numId="80" w16cid:durableId="751659636">
+    <w:abstractNumId w:val="30"/>
+  </w:num>
+  <w:num w:numId="81" w16cid:durableId="756439478">
+    <w:abstractNumId w:val="60"/>
+  </w:num>
+  <w:num w:numId="82" w16cid:durableId="473255158">
+    <w:abstractNumId w:val="53"/>
+  </w:num>
+  <w:num w:numId="83" w16cid:durableId="1985695399">
+    <w:abstractNumId w:val="21"/>
+  </w:num>
+  <w:num w:numId="84" w16cid:durableId="603615781">
+    <w:abstractNumId w:val="52"/>
+  </w:num>
+  <w:num w:numId="85" w16cid:durableId="1386834011">
     <w:abstractNumId w:val="41"/>
   </w:num>
-  <w:num w:numId="13" w16cid:durableId="852837458">
-    <w:abstractNumId w:val="63"/>
+  <w:num w:numId="86" w16cid:durableId="1935437712">
+    <w:abstractNumId w:val="40"/>
   </w:num>
-  <w:num w:numId="14" w16cid:durableId="69426069">
-    <w:abstractNumId w:val="72"/>
+  <w:num w:numId="87" w16cid:durableId="432752025">
+    <w:abstractNumId w:val="35"/>
   </w:num>
-  <w:num w:numId="15" w16cid:durableId="418212339">
-    <w:abstractNumId w:val="24"/>
-  </w:num>
-  <w:num w:numId="16" w16cid:durableId="2012368573">
-    <w:abstractNumId w:val="5"/>
-  </w:num>
-  <w:num w:numId="17" w16cid:durableId="849685296">
-    <w:abstractNumId w:val="71"/>
-  </w:num>
-  <w:num w:numId="18" w16cid:durableId="1293973808">
+  <w:num w:numId="88" w16cid:durableId="1017073944">
     <w:abstractNumId w:val="33"/>
   </w:num>
-  <w:num w:numId="19" w16cid:durableId="1112093579">
-    <w:abstractNumId w:val="36"/>
-  </w:num>
-  <w:num w:numId="20" w16cid:durableId="725221431">
-    <w:abstractNumId w:val="14"/>
-  </w:num>
-  <w:num w:numId="21" w16cid:durableId="519051001">
-    <w:abstractNumId w:val="17"/>
-  </w:num>
-  <w:num w:numId="22" w16cid:durableId="351734411">
+  <w:num w:numId="89" w16cid:durableId="428162675">
     <w:abstractNumId w:val="0"/>
   </w:num>
-  <w:num w:numId="23" w16cid:durableId="1659576760">
-    <w:abstractNumId w:val="40"/>
-  </w:num>
-  <w:num w:numId="24" w16cid:durableId="995648169">
-    <w:abstractNumId w:val="15"/>
-  </w:num>
-  <w:num w:numId="25" w16cid:durableId="2125273593">
-    <w:abstractNumId w:val="75"/>
-  </w:num>
-  <w:num w:numId="26" w16cid:durableId="1192763523">
-    <w:abstractNumId w:val="42"/>
-  </w:num>
-  <w:num w:numId="27" w16cid:durableId="419303702">
-    <w:abstractNumId w:val="70"/>
-  </w:num>
-  <w:num w:numId="28" w16cid:durableId="1737972737">
-    <w:abstractNumId w:val="30"/>
-  </w:num>
-  <w:num w:numId="29" w16cid:durableId="405029989">
-    <w:abstractNumId w:val="31"/>
-  </w:num>
-  <w:num w:numId="30" w16cid:durableId="1056709340">
-    <w:abstractNumId w:val="27"/>
-  </w:num>
-  <w:num w:numId="31" w16cid:durableId="619343773">
-    <w:abstractNumId w:val="65"/>
-  </w:num>
-  <w:num w:numId="32" w16cid:durableId="1593465196">
-    <w:abstractNumId w:val="12"/>
-  </w:num>
-  <w:num w:numId="33" w16cid:durableId="808782727">
-    <w:abstractNumId w:val="39"/>
-  </w:num>
-  <w:num w:numId="34" w16cid:durableId="1237976542">
-    <w:abstractNumId w:val="59"/>
-  </w:num>
-  <w:num w:numId="35" w16cid:durableId="1007363703">
+  <w:num w:numId="90" w16cid:durableId="1289508407">
     <w:abstractNumId w:val="38"/>
   </w:num>
-  <w:num w:numId="36" w16cid:durableId="628047081">
-    <w:abstractNumId w:val="52"/>
+  <w:num w:numId="91" w16cid:durableId="1805539883">
+    <w:abstractNumId w:val="85"/>
   </w:num>
-  <w:num w:numId="37" w16cid:durableId="275867737">
-    <w:abstractNumId w:val="43"/>
-  </w:num>
-  <w:num w:numId="38" w16cid:durableId="762920877">
-    <w:abstractNumId w:val="18"/>
-  </w:num>
-  <w:num w:numId="39" w16cid:durableId="127748478">
-    <w:abstractNumId w:val="21"/>
-  </w:num>
-  <w:num w:numId="40" w16cid:durableId="1381586733">
-    <w:abstractNumId w:val="23"/>
-  </w:num>
-  <w:num w:numId="41" w16cid:durableId="1652056397">
-    <w:abstractNumId w:val="3"/>
-  </w:num>
-  <w:num w:numId="42" w16cid:durableId="48379714">
-    <w:abstractNumId w:val="25"/>
-  </w:num>
-  <w:num w:numId="43" w16cid:durableId="1266882554">
-    <w:abstractNumId w:val="9"/>
-  </w:num>
-  <w:num w:numId="44" w16cid:durableId="14962304">
-    <w:abstractNumId w:val="60"/>
-  </w:num>
-  <w:num w:numId="45" w16cid:durableId="675765725">
-    <w:abstractNumId w:val="19"/>
-  </w:num>
-  <w:num w:numId="46" w16cid:durableId="1737127939">
-    <w:abstractNumId w:val="54"/>
-  </w:num>
-  <w:num w:numId="47" w16cid:durableId="1865363348">
-    <w:abstractNumId w:val="64"/>
-  </w:num>
-  <w:num w:numId="48" w16cid:durableId="1321884510">
-    <w:abstractNumId w:val="13"/>
-  </w:num>
-  <w:num w:numId="49" w16cid:durableId="433749920">
-    <w:abstractNumId w:val="78"/>
-  </w:num>
-  <w:num w:numId="50" w16cid:durableId="2050912484">
+  <w:num w:numId="92" w16cid:durableId="132794698">
     <w:abstractNumId w:val="67"/>
-  </w:num>
-  <w:num w:numId="51" w16cid:durableId="328599735">
-    <w:abstractNumId w:val="1"/>
-  </w:num>
-  <w:num w:numId="52" w16cid:durableId="516315795">
-    <w:abstractNumId w:val="79"/>
-  </w:num>
-  <w:num w:numId="53" w16cid:durableId="720634748">
-    <w:abstractNumId w:val="47"/>
-  </w:num>
-  <w:num w:numId="54" w16cid:durableId="916137058">
-    <w:abstractNumId w:val="82"/>
-  </w:num>
-  <w:num w:numId="55" w16cid:durableId="1956209529">
-    <w:abstractNumId w:val="69"/>
-  </w:num>
-  <w:num w:numId="56" w16cid:durableId="383022568">
-    <w:abstractNumId w:val="22"/>
-  </w:num>
-  <w:num w:numId="57" w16cid:durableId="92481767">
-    <w:abstractNumId w:val="56"/>
-  </w:num>
-  <w:num w:numId="58" w16cid:durableId="1325930890">
-    <w:abstractNumId w:val="4"/>
-  </w:num>
-  <w:num w:numId="59" w16cid:durableId="962343949">
-    <w:abstractNumId w:val="11"/>
-  </w:num>
-  <w:num w:numId="60" w16cid:durableId="939338339">
-    <w:abstractNumId w:val="55"/>
-  </w:num>
-  <w:num w:numId="61" w16cid:durableId="64226443">
-    <w:abstractNumId w:val="73"/>
-  </w:num>
-  <w:num w:numId="62" w16cid:durableId="1156844156">
-    <w:abstractNumId w:val="76"/>
-  </w:num>
-  <w:num w:numId="63" w16cid:durableId="747772550">
-    <w:abstractNumId w:val="26"/>
-  </w:num>
-  <w:num w:numId="64" w16cid:durableId="412699077">
-    <w:abstractNumId w:val="35"/>
-  </w:num>
-  <w:num w:numId="65" w16cid:durableId="886720265">
-    <w:abstractNumId w:val="49"/>
-  </w:num>
-  <w:num w:numId="66" w16cid:durableId="1185943042">
-    <w:abstractNumId w:val="8"/>
-  </w:num>
-  <w:num w:numId="67" w16cid:durableId="802580017">
-    <w:abstractNumId w:val="32"/>
-  </w:num>
-  <w:num w:numId="68" w16cid:durableId="1719665321">
-    <w:abstractNumId w:val="37"/>
-  </w:num>
-  <w:num w:numId="69" w16cid:durableId="154415603">
-    <w:abstractNumId w:val="77"/>
-  </w:num>
-  <w:num w:numId="70" w16cid:durableId="855269244">
-    <w:abstractNumId w:val="61"/>
-  </w:num>
-  <w:num w:numId="71" w16cid:durableId="2105564516">
-    <w:abstractNumId w:val="10"/>
-  </w:num>
-  <w:num w:numId="72" w16cid:durableId="21982529">
-    <w:abstractNumId w:val="16"/>
-  </w:num>
-  <w:num w:numId="73" w16cid:durableId="751197906">
-    <w:abstractNumId w:val="62"/>
-  </w:num>
-  <w:num w:numId="74" w16cid:durableId="1151600853">
-    <w:abstractNumId w:val="74"/>
-  </w:num>
-  <w:num w:numId="75" w16cid:durableId="194008492">
-    <w:abstractNumId w:val="66"/>
-  </w:num>
-  <w:num w:numId="76" w16cid:durableId="1476331496">
-    <w:abstractNumId w:val="81"/>
-  </w:num>
-  <w:num w:numId="77" w16cid:durableId="1933854576">
-    <w:abstractNumId w:val="51"/>
-  </w:num>
-  <w:num w:numId="78" w16cid:durableId="2113940026">
-    <w:abstractNumId w:val="28"/>
-  </w:num>
-  <w:num w:numId="79" w16cid:durableId="860700698">
-    <w:abstractNumId w:val="68"/>
-  </w:num>
-  <w:num w:numId="80" w16cid:durableId="751659636">
-    <w:abstractNumId w:val="29"/>
-  </w:num>
-  <w:num w:numId="81" w16cid:durableId="756439478">
-    <w:abstractNumId w:val="53"/>
-  </w:num>
-  <w:num w:numId="82" w16cid:durableId="473255158">
-    <w:abstractNumId w:val="46"/>
-  </w:num>
-  <w:num w:numId="83" w16cid:durableId="1985695399">
-    <w:abstractNumId w:val="20"/>
   </w:num>
   <w:numIdMacAtCleanup w:val="50"/>
 </w:numbering>

</xml_diff>